<commit_message>
ded complaint: complete transcription of FILED-EXAMPLE-complaint (fb-w0vj.1)
fb diff --content: G0 PASS (8 pages); G2 residuals template-driven only.
</commit_message>
<xml_diff>
--- a/courts/third-circuit/delaware/federal/district/complaint/usage/OUTPUT-complaint.docx
+++ b/courts/third-circuit/delaware/federal/district/complaint/usage/OUTPUT-complaint.docx
@@ -169,7 +169,7 @@
               <w:t xml:space="preserve"> </w:t>
             </w:r>
             <w:r>
-              <w:t xml:space="preserve">INC.,</w:t>
+              <w:t xml:space="preserve">INC.</w:t>
             </w:r>
           </w:p>
           <w:p>
@@ -460,14 +460,15 @@
         <w:t xml:space="preserve">follows:</w:t>
       </w:r>
     </w:p>
-    <w:bookmarkStart w:id="20" w:name="nature-of-the-action"/>
     <w:p>
       <w:pPr>
         <w:pStyle w:val="Heading1"/>
       </w:pPr>
+      <w:bookmarkStart w:id="109" w:name="_f96794afb107ca6f5d98c4ff18adc0aee0ad0c3"/>
       <w:r>
         <w:t xml:space="preserve">NATURE OF THE ACTION</w:t>
       </w:r>
+      <w:bookmarkEnd w:id="109"/>
     </w:p>
     <w:p>
       <w:pPr>
@@ -477,15 +478,15 @@
         <w:t xml:space="preserve">1. This is an action for infringement of United States Patent No. 12,733,955 (the “’955 Patent”) under 35 U.S.C. § 271. The ’955 Patent is attached to this Complaint as Exhibit A.</w:t>
       </w:r>
     </w:p>
-    <w:bookmarkEnd w:id="20"/>
-    <w:bookmarkStart w:id="21" w:name="parties"/>
     <w:p>
       <w:pPr>
         <w:pStyle w:val="Heading1"/>
       </w:pPr>
+      <w:bookmarkStart w:id="110" w:name="_parties"/>
       <w:r>
         <w:t xml:space="preserve">PARTIES</w:t>
       </w:r>
+      <w:bookmarkEnd w:id="110"/>
     </w:p>
     <w:p>
       <w:pPr>
@@ -527,22 +528,38 @@
         <w:t xml:space="preserve">6. Defendant Atraverse is an entity incorporated in the state of Delaware and having its principal place of business at 2611 S Coast Hwy 101, Suite 204, Cardiff-by-the-Sea, California 92007.</w:t>
       </w:r>
     </w:p>
-    <w:bookmarkEnd w:id="21"/>
-    <w:bookmarkStart w:id="22" w:name="jurisdiction-and-venue"/>
     <w:p>
       <w:pPr>
         <w:pStyle w:val="Heading1"/>
       </w:pPr>
+      <w:bookmarkStart w:id="111" w:name="_0e2df9c0fe52ebd43073ce38f4076c822df9b17"/>
       <w:r>
         <w:t xml:space="preserve">JURISDICTION AND VENUE</w:t>
       </w:r>
+      <w:bookmarkEnd w:id="111"/>
     </w:p>
     <w:p>
       <w:pPr>
         <w:pStyle w:val="FirstParagraph"/>
       </w:pPr>
       <w:r>
-        <w:t xml:space="preserve">7. This is an action for patent infringement arising under the patent laws of the United States, 35 U.S.C. §§ 100 et seq. This Court has subject matter jurisdiction pursuant to 28 U.S.C. §§ 1331 and 1338(a).</w:t>
+        <w:t xml:space="preserve">7. This is an action for patent infringement arising under the patent laws of the United States, 35 U.S.C. §§ 100</w:t>
+      </w:r>
+      <w:r>
+        <w:t xml:space="preserve"> </w:t>
+      </w:r>
+      <w:r>
+        <w:rPr>
+          <w:i/>
+          <w:iCs/>
+        </w:rPr>
+        <w:t xml:space="preserve">et seq.</w:t>
+      </w:r>
+      <w:r>
+        <w:t xml:space="preserve"> </w:t>
+      </w:r>
+      <w:r>
+        <w:t xml:space="preserve">This Court has subject matter jurisdiction pursuant to 28 U.S.C. §§ 1331 and 1338(a).</w:t>
       </w:r>
     </w:p>
     <w:p>
@@ -561,15 +578,15 @@
         <w:t xml:space="preserve">9. Venue is proper in this District under 28 U.S.C. § 1400(b).</w:t>
       </w:r>
     </w:p>
-    <w:bookmarkEnd w:id="22"/>
-    <w:bookmarkStart w:id="23" w:name="factual-background"/>
     <w:p>
       <w:pPr>
         <w:pStyle w:val="Heading1"/>
       </w:pPr>
+      <w:bookmarkStart w:id="112" w:name="_b8e5b8837ccf89115edfee2c48cc11b996d00ec"/>
       <w:r>
         <w:t xml:space="preserve">FACTUAL BACKGROUND</w:t>
       </w:r>
+      <w:bookmarkEnd w:id="112"/>
     </w:p>
     <w:p>
       <w:pPr>
@@ -611,15 +628,15 @@
         <w:t xml:space="preserve">14. As set forth below and in the claim chart attached hereto as Exhibit B, Atraverse’s HOTWIRE™ device infringes at least one claim of the ’955 Patent.</w:t>
       </w:r>
     </w:p>
-    <w:bookmarkEnd w:id="23"/>
-    <w:bookmarkStart w:id="25" w:name="Xa9e766f770da14bea195c3e3bc56dcf67009940"/>
     <w:p>
       <w:pPr>
         <w:pStyle w:val="Heading1"/>
       </w:pPr>
+      <w:bookmarkStart w:id="113" w:name="_a9e766f770da14bea195c3e3bc56dcf67009940"/>
       <w:r>
         <w:t xml:space="preserve">COUNT I: INFRINGEMENT OF U.S. PATENT NO. 12,733,955</w:t>
       </w:r>
+      <w:bookmarkEnd w:id="113"/>
     </w:p>
     <w:p>
       <w:pPr>
@@ -642,7 +659,23 @@
         <w:pStyle w:val="BodyText"/>
       </w:pPr>
       <w:r>
-        <w:t xml:space="preserve">17. Upon information and belief, Atraverse has indirectly infringed at least claims 1 and 22 of the ’955 Patent by, among other things, actively inducing the direct infringement of others, such as physicians using the HOTWIRE™. For example, Atraverse instructs and encourages physicians on the use of the HOTWIRE™ for transseptal procedures. See Ex. B at 12 (Mr. Slump explaining, “instead of mechanically advancing your way across the septum, you just press the button, use a little blast of radiofrequency energy and/or electrocautery if you will, denature the tissue and gently advance across.”). Upon information and belief, Atraverse knew that the acts it induced constitute patent infringement.</w:t>
+        <w:t xml:space="preserve">17. Upon information and belief, Atraverse has indirectly infringed at least claims 1 and 22 of the ’955 Patent by, among other things, actively inducing the direct infringement of others, such as physicians using the HOTWIRE™. For example, Atraverse instructs and encourages physicians on the use of the HOTWIRE™ for transseptal procedures.</w:t>
+      </w:r>
+      <w:r>
+        <w:t xml:space="preserve"> </w:t>
+      </w:r>
+      <w:r>
+        <w:rPr>
+          <w:i/>
+          <w:iCs/>
+        </w:rPr>
+        <w:t xml:space="preserve">See</w:t>
+      </w:r>
+      <w:r>
+        <w:t xml:space="preserve"> </w:t>
+      </w:r>
+      <w:r>
+        <w:t xml:space="preserve">Ex. B at 12 (Mr. Slump explaining, “instead of mechanically advancing your way across the septum, you just press the button, use a little blast of radiofrequency energy and/or electrocautery if you will, denature the tissue and gently advance across.”). Upon information and belief, Atraverse knew that the acts it induced constitute patent infringement.</w:t>
       </w:r>
     </w:p>
     <w:p>
@@ -650,13 +683,55 @@
         <w:pStyle w:val="BodyText"/>
       </w:pPr>
       <w:r>
-        <w:t xml:space="preserve">18. Upon information and belief, Atraverse has been aware of the ’955 Patent since at least its issuance on September 15, 2026. On August 18, 2025, Boston Scientific filed its initial complaint against Atraverse asserting U.S. Patent No. 11,998,238 (the “’238 Patent”), which is the great-great-grandparent of the ’955 Patent. Complaint, Aug. 18, 2025, Boston Scientific Corp. v. Atraverse Medical, Inc., C.A. No. 25-cv-01035-JLH (D. Del.); see also Third Amended Complaint, June 18, 2026, Boston Scientific Corp. v. Atraverse Medical, Inc., C.A. No. 25-cv-01035-JLH (D. Del.) (including allegations of infringement of patents within the same family as the ’955 Patent: the ’238 Patent, U.S. Patent No. 12,433,639 (the “’639 Patent”), U.S. Patent No. 12,599,406 (the “’406 Patent”), U.S. Patent No. 12,636,040 (the “’040 Patent”), and U.S. Patent No. 12,653,576 (the “’576 Patent”)). Boston Scientific followed its initial complaint by sending Mr. Slump a cease and desist letter on August 20, 2025, charging Atraverse with infringement of the ’238 Patent and informing Atraverse that the HOTWIRE™ “will also infringe Boston Scientific’s forthcoming patent based on the currently allowed claims of the ’196 application.”</w:t>
+        <w:t xml:space="preserve">18. Upon information and belief, Atraverse has been aware of the ’955 Patent since at least its issuance on September 15, 2026. On August 18, 2025, Boston Scientific filed its initial complaint against Atraverse asserting U.S. Patent No. 11,998,238 (the “’238 Patent”), which is the great-great-grandparent of the ’955 Patent. Complaint, Aug. 18, 2025,</w:t>
+      </w:r>
+      <w:r>
+        <w:t xml:space="preserve"> </w:t>
+      </w:r>
+      <w:r>
+        <w:rPr>
+          <w:i/>
+          <w:iCs/>
+        </w:rPr>
+        <w:t xml:space="preserve">Boston Scientific Corp. v. Atraverse Medical, Inc.</w:t>
+      </w:r>
+      <w:r>
+        <w:t xml:space="preserve">, C.A. No. 25-cv-01035-JLH (D. Del.);</w:t>
+      </w:r>
+      <w:r>
+        <w:t xml:space="preserve"> </w:t>
+      </w:r>
+      <w:r>
+        <w:rPr>
+          <w:i/>
+          <w:iCs/>
+        </w:rPr>
+        <w:t xml:space="preserve">see also</w:t>
+      </w:r>
+      <w:r>
+        <w:t xml:space="preserve"> </w:t>
+      </w:r>
+      <w:r>
+        <w:t xml:space="preserve">Third Amended Complaint, June 18, 2026,</w:t>
+      </w:r>
+      <w:r>
+        <w:t xml:space="preserve"> </w:t>
+      </w:r>
+      <w:r>
+        <w:rPr>
+          <w:i/>
+          <w:iCs/>
+        </w:rPr>
+        <w:t xml:space="preserve">Boston Scientific Corp. v. Atraverse Medical, Inc.</w:t>
+      </w:r>
+      <w:r>
+        <w:t xml:space="preserve">, C.A. No. 25-cv-01035-JLH (D. Del.) (including allegations of infringement of patents within the same family as the ’955 Patent: the ’238 Patent, U.S. Patent No. 12,433,639 (the “’639 Patent”), U.S. Patent No. 12,599,406 (the “’406 Patent”), U.S. Patent No. 12,636,040 (the “’040 Patent”), and U.S. Patent No. 12,653,576 (the “’576 Patent”)). Boston Scientific followed its initial complaint by sending Mr. Slump a cease and desist letter on August 20, 2025, charging Atraverse with infringement of the ’238 Patent and informing Atraverse that the HOTWIRE™ “will also infringe Boston Scientific’s forthcoming patent based on the currently allowed claims of the ’196 application.”</w:t>
       </w:r>
       <w:r>
         <w:rPr>
           <w:rStyle w:val="FootnoteReference"/>
         </w:rPr>
-        <w:footnoteReference w:id="24"/>
+        <w:footnoteReference w:id="114"/>
       </w:r>
       <w:r>
         <w:t xml:space="preserve"> </w:t>
@@ -689,22 +764,22 @@
         <w:t xml:space="preserve">21. As a result of Atraverse’s unlawful infringement of the ’955 Patent, Boston Scientific has suffered and will continue to suffer damages.</w:t>
       </w:r>
     </w:p>
-    <w:bookmarkEnd w:id="25"/>
-    <w:bookmarkStart w:id="26" w:name="prayer-for-relief"/>
     <w:p>
       <w:pPr>
         <w:pStyle w:val="Heading1"/>
       </w:pPr>
+      <w:bookmarkStart w:id="115" w:name="_ef66b8fb8023651585f5d55fe5a420ee6f5e8cc"/>
       <w:r>
         <w:t xml:space="preserve">PRAYER FOR RELIEF</w:t>
       </w:r>
+      <w:bookmarkEnd w:id="115"/>
     </w:p>
     <w:p>
       <w:pPr>
         <w:pStyle w:val="FirstParagraph"/>
       </w:pPr>
       <w:r>
-        <w:t xml:space="preserve">WHEREFORE, Boston Scientific respectfully requests the following relief:</w:t>
+        <w:t xml:space="preserve">22. WHEREFORE, Boston Scientific respectfully requests the following relief:</w:t>
       </w:r>
     </w:p>
     <w:p>
@@ -847,22 +922,22 @@
         <w:t xml:space="preserve">Such further and other relief as this Court deems proper and just.</w:t>
       </w:r>
     </w:p>
-    <w:bookmarkEnd w:id="26"/>
-    <w:bookmarkStart w:id="27" w:name="jury-trial-demand"/>
     <w:p>
       <w:pPr>
         <w:pStyle w:val="Heading1"/>
       </w:pPr>
+      <w:bookmarkStart w:id="116" w:name="_3a29698ad4ef7f1642d8b511daf1ca500d3840c"/>
       <w:r>
         <w:t xml:space="preserve">JURY TRIAL DEMAND</w:t>
       </w:r>
+      <w:bookmarkEnd w:id="116"/>
     </w:p>
     <w:p>
       <w:pPr>
         <w:pStyle w:val="FirstParagraph"/>
       </w:pPr>
       <w:r>
-        <w:t xml:space="preserve">Pursuant to Federal Rule of Civil Procedure 38(b), Boston Scientific hereby demands a trial by jury of all issues that are or may become triable.</w:t>
+        <w:t xml:space="preserve">23. Pursuant to Federal Rule of Civil Procedure 38(b), Boston Scientific hereby demands a trial by jury of all issues that are or may become triable.</w:t>
       </w:r>
     </w:p>
     <w:p>
@@ -924,24 +999,52 @@
               <w:pStyle w:val="Single"/>
             </w:pPr>
             <w:r>
+              <w:rPr>
+                <w:b/>
+                <w:bCs/>
+              </w:rPr>
               <w:t xml:space="preserve">FISH</w:t>
             </w:r>
             <w:r>
-              <w:t xml:space="preserve"> </w:t>
-            </w:r>
-            <w:r>
+              <w:rPr>
+                <w:b/>
+                <w:bCs/>
+              </w:rPr>
+              <w:t xml:space="preserve"> </w:t>
+            </w:r>
+            <w:r>
+              <w:rPr>
+                <w:b/>
+                <w:bCs/>
+              </w:rPr>
               <w:t xml:space="preserve">&amp;</w:t>
             </w:r>
             <w:r>
-              <w:t xml:space="preserve"> </w:t>
-            </w:r>
-            <w:r>
+              <w:rPr>
+                <w:b/>
+                <w:bCs/>
+              </w:rPr>
+              <w:t xml:space="preserve"> </w:t>
+            </w:r>
+            <w:r>
+              <w:rPr>
+                <w:b/>
+                <w:bCs/>
+              </w:rPr>
               <w:t xml:space="preserve">RICHARDSON</w:t>
             </w:r>
             <w:r>
-              <w:t xml:space="preserve"> </w:t>
-            </w:r>
-            <w:r>
+              <w:rPr>
+                <w:b/>
+                <w:bCs/>
+              </w:rPr>
+              <w:t xml:space="preserve"> </w:t>
+            </w:r>
+            <w:r>
+              <w:rPr>
+                <w:b/>
+                <w:bCs/>
+              </w:rPr>
               <w:t xml:space="preserve">P.C.</w:t>
             </w:r>
           </w:p>
@@ -954,256 +1057,12 @@
             <w:pPr>
               <w:pStyle w:val="Single"/>
             </w:pPr>
-            <w:r>
-              <w:t xml:space="preserve">/s/</w:t>
-            </w:r>
-            <w:r>
-              <w:t xml:space="preserve"> </w:t>
-            </w:r>
-            <w:r>
-              <w:t xml:space="preserve">Nitika</w:t>
-            </w:r>
-            <w:r>
-              <w:t xml:space="preserve"> </w:t>
-            </w:r>
-            <w:r>
-              <w:t xml:space="preserve">Gupta</w:t>
-            </w:r>
-            <w:r>
-              <w:t xml:space="preserve"> </w:t>
-            </w:r>
-            <w:r>
-              <w:t xml:space="preserve">Fiorella</w:t>
-            </w:r>
-          </w:p>
-          <w:p>
-            <w:pPr>
-              <w:pStyle w:val="Single"/>
-            </w:pPr>
-            <w:r>
-              <w:t xml:space="preserve">Martina</w:t>
-            </w:r>
-            <w:r>
-              <w:t xml:space="preserve"> </w:t>
-            </w:r>
-            <w:r>
-              <w:t xml:space="preserve">Tyreus</w:t>
-            </w:r>
-            <w:r>
-              <w:t xml:space="preserve"> </w:t>
-            </w:r>
-            <w:r>
-              <w:t xml:space="preserve">Hufnal</w:t>
-            </w:r>
-            <w:r>
-              <w:t xml:space="preserve"> </w:t>
-            </w:r>
-            <w:r>
-              <w:t xml:space="preserve">(No. 4771)</w:t>
-            </w:r>
-          </w:p>
-          <w:p>
-            <w:pPr>
-              <w:pStyle w:val="Single"/>
-            </w:pPr>
-            <w:r>
-              <w:t xml:space="preserve">Douglas</w:t>
-            </w:r>
-            <w:r>
-              <w:t xml:space="preserve"> </w:t>
-            </w:r>
-            <w:r>
-              <w:t xml:space="preserve">E.</w:t>
-            </w:r>
-            <w:r>
-              <w:t xml:space="preserve"> </w:t>
-            </w:r>
-            <w:r>
-              <w:t xml:space="preserve">McCann</w:t>
-            </w:r>
-            <w:r>
-              <w:t xml:space="preserve"> </w:t>
-            </w:r>
-            <w:r>
-              <w:t xml:space="preserve">(No. 3852)</w:t>
-            </w:r>
-          </w:p>
-          <w:p>
-            <w:pPr>
-              <w:pStyle w:val="Single"/>
-            </w:pPr>
-            <w:r>
-              <w:t xml:space="preserve">Nitika</w:t>
-            </w:r>
-            <w:r>
-              <w:t xml:space="preserve"> </w:t>
-            </w:r>
-            <w:r>
-              <w:t xml:space="preserve">Gupta</w:t>
-            </w:r>
-            <w:r>
-              <w:t xml:space="preserve"> </w:t>
-            </w:r>
-            <w:r>
-              <w:t xml:space="preserve">Fiorella</w:t>
-            </w:r>
-            <w:r>
-              <w:t xml:space="preserve"> </w:t>
-            </w:r>
-            <w:r>
-              <w:t xml:space="preserve">(No. 5898)</w:t>
-            </w:r>
-          </w:p>
-          <w:p>
-            <w:pPr>
-              <w:pStyle w:val="Single"/>
-            </w:pPr>
-            <w:r>
-              <w:t xml:space="preserve">Vidhu</w:t>
-            </w:r>
-            <w:r>
-              <w:t xml:space="preserve"> </w:t>
-            </w:r>
-            <w:r>
-              <w:t xml:space="preserve">B.</w:t>
-            </w:r>
-            <w:r>
-              <w:t xml:space="preserve"> </w:t>
-            </w:r>
-            <w:r>
-              <w:t xml:space="preserve">Joshi</w:t>
-            </w:r>
-            <w:r>
-              <w:t xml:space="preserve"> </w:t>
-            </w:r>
-            <w:r>
-              <w:t xml:space="preserve">(No. 7608)</w:t>
-            </w:r>
-          </w:p>
-          <w:p>
-            <w:pPr>
-              <w:pStyle w:val="Single"/>
-            </w:pPr>
-            <w:r>
-              <w:t xml:space="preserve">222</w:t>
-            </w:r>
-            <w:r>
-              <w:t xml:space="preserve"> </w:t>
-            </w:r>
-            <w:r>
-              <w:t xml:space="preserve">Delaware</w:t>
-            </w:r>
-            <w:r>
-              <w:t xml:space="preserve"> </w:t>
-            </w:r>
-            <w:r>
-              <w:t xml:space="preserve">Avenue,</w:t>
-            </w:r>
-            <w:r>
-              <w:t xml:space="preserve"> </w:t>
-            </w:r>
-            <w:r>
-              <w:t xml:space="preserve">17th</w:t>
-            </w:r>
-            <w:r>
-              <w:t xml:space="preserve"> </w:t>
-            </w:r>
-            <w:r>
-              <w:t xml:space="preserve">Floor</w:t>
-            </w:r>
-          </w:p>
-          <w:p>
-            <w:pPr>
-              <w:pStyle w:val="Single"/>
-            </w:pPr>
-            <w:r>
-              <w:t xml:space="preserve">Wilmington,</w:t>
-            </w:r>
-            <w:r>
-              <w:t xml:space="preserve"> </w:t>
-            </w:r>
-            <w:r>
-              <w:t xml:space="preserve">DE</w:t>
-            </w:r>
-            <w:r>
-              <w:t xml:space="preserve"> </w:t>
-            </w:r>
-            <w:r>
-              <w:t xml:space="preserve">19801</w:t>
-            </w:r>
-          </w:p>
-          <w:p>
-            <w:pPr>
-              <w:pStyle w:val="Single"/>
-            </w:pPr>
-            <w:r>
-              <w:t xml:space="preserve">(302)</w:t>
-            </w:r>
-            <w:r>
-              <w:t xml:space="preserve"> </w:t>
-            </w:r>
-            <w:r>
-              <w:t xml:space="preserve">652-5070</w:t>
-            </w:r>
-          </w:p>
-          <w:p>
-            <w:pPr>
-              <w:pStyle w:val="Single"/>
-            </w:pPr>
-            <w:r>
-              <w:t xml:space="preserve">hufnal@fr.com;</w:t>
-            </w:r>
-            <w:r>
-              <w:t xml:space="preserve"> </w:t>
-            </w:r>
-            <w:r>
-              <w:t xml:space="preserve">dmccann@fr.com;</w:t>
-            </w:r>
-          </w:p>
-          <w:p>
-            <w:pPr>
-              <w:pStyle w:val="Single"/>
-            </w:pPr>
-            <w:r>
-              <w:t xml:space="preserve">fiorella@fr.com;</w:t>
-            </w:r>
-            <w:r>
-              <w:t xml:space="preserve"> </w:t>
-            </w:r>
-            <w:r>
-              <w:t xml:space="preserve">joshi@fr.com</w:t>
-            </w:r>
-          </w:p>
-          <w:p>
-            <w:pPr>
-              <w:pStyle w:val="Single"/>
-            </w:pPr>
-          </w:p>
-          <w:p>
-            <w:pPr>
-              <w:pStyle w:val="Single"/>
-            </w:pPr>
-            <w:r>
-              <w:t xml:space="preserve">Todd</w:t>
-            </w:r>
-            <w:r>
-              <w:t xml:space="preserve"> </w:t>
-            </w:r>
-            <w:r>
-              <w:t xml:space="preserve">Miller</w:t>
-            </w:r>
-            <w:r>
-              <w:t xml:space="preserve"> </w:t>
-            </w:r>
-            <w:r>
-              <w:t xml:space="preserve">(</w:t>
-            </w:r>
             <w:r>
               <w:rPr>
                 <w:i/>
                 <w:iCs/>
               </w:rPr>
-              <w:t xml:space="preserve">pro</w:t>
+              <w:t xml:space="preserve">/s/</w:t>
             </w:r>
             <w:r>
               <w:rPr>
@@ -1217,7 +1076,7 @@
                 <w:i/>
                 <w:iCs/>
               </w:rPr>
-              <w:t xml:space="preserve">hac</w:t>
+              <w:t xml:space="preserve">Nitika</w:t>
             </w:r>
             <w:r>
               <w:rPr>
@@ -1231,54 +1090,251 @@
                 <w:i/>
                 <w:iCs/>
               </w:rPr>
-              <w:t xml:space="preserve">vice</w:t>
-            </w:r>
-            <w:r>
-              <w:t xml:space="preserve"> </w:t>
-            </w:r>
-            <w:r>
-              <w:t xml:space="preserve">forthcoming)</w:t>
-            </w:r>
-          </w:p>
-          <w:p>
-            <w:pPr>
-              <w:pStyle w:val="Single"/>
-            </w:pPr>
-            <w:r>
-              <w:t xml:space="preserve">Tyler</w:t>
-            </w:r>
-            <w:r>
-              <w:t xml:space="preserve"> </w:t>
-            </w:r>
-            <w:r>
-              <w:t xml:space="preserve">Train</w:t>
-            </w:r>
-            <w:r>
-              <w:t xml:space="preserve"> </w:t>
-            </w:r>
-            <w:r>
-              <w:t xml:space="preserve">(</w:t>
+              <w:t xml:space="preserve">Gupta</w:t>
             </w:r>
             <w:r>
               <w:rPr>
                 <w:i/>
                 <w:iCs/>
               </w:rPr>
-              <w:t xml:space="preserve">pro</w:t>
+              <w:t xml:space="preserve"> </w:t>
             </w:r>
             <w:r>
               <w:rPr>
                 <w:i/>
                 <w:iCs/>
               </w:rPr>
-              <w:t xml:space="preserve"> </w:t>
+              <w:t xml:space="preserve">Fiorella</w:t>
+            </w:r>
+          </w:p>
+          <w:p>
+            <w:pPr>
+              <w:pStyle w:val="Single"/>
+            </w:pPr>
+            <w:r>
+              <w:t xml:space="preserve">Martina</w:t>
+            </w:r>
+            <w:r>
+              <w:t xml:space="preserve"> </w:t>
+            </w:r>
+            <w:r>
+              <w:t xml:space="preserve">Tyreus</w:t>
+            </w:r>
+            <w:r>
+              <w:t xml:space="preserve"> </w:t>
+            </w:r>
+            <w:r>
+              <w:t xml:space="preserve">Hufnal</w:t>
+            </w:r>
+            <w:r>
+              <w:t xml:space="preserve"> </w:t>
+            </w:r>
+            <w:r>
+              <w:t xml:space="preserve">(No. 4771)</w:t>
+            </w:r>
+          </w:p>
+          <w:p>
+            <w:pPr>
+              <w:pStyle w:val="Single"/>
+            </w:pPr>
+            <w:r>
+              <w:t xml:space="preserve">Douglas</w:t>
+            </w:r>
+            <w:r>
+              <w:t xml:space="preserve"> </w:t>
+            </w:r>
+            <w:r>
+              <w:t xml:space="preserve">E.</w:t>
+            </w:r>
+            <w:r>
+              <w:t xml:space="preserve"> </w:t>
+            </w:r>
+            <w:r>
+              <w:t xml:space="preserve">McCann</w:t>
+            </w:r>
+            <w:r>
+              <w:t xml:space="preserve"> </w:t>
+            </w:r>
+            <w:r>
+              <w:t xml:space="preserve">(No. 3852)</w:t>
+            </w:r>
+          </w:p>
+          <w:p>
+            <w:pPr>
+              <w:pStyle w:val="Single"/>
+            </w:pPr>
+            <w:r>
+              <w:t xml:space="preserve">Nitika</w:t>
+            </w:r>
+            <w:r>
+              <w:t xml:space="preserve"> </w:t>
+            </w:r>
+            <w:r>
+              <w:t xml:space="preserve">Gupta</w:t>
+            </w:r>
+            <w:r>
+              <w:t xml:space="preserve"> </w:t>
+            </w:r>
+            <w:r>
+              <w:t xml:space="preserve">Fiorella</w:t>
+            </w:r>
+            <w:r>
+              <w:t xml:space="preserve"> </w:t>
+            </w:r>
+            <w:r>
+              <w:t xml:space="preserve">(No. 5898)</w:t>
+            </w:r>
+          </w:p>
+          <w:p>
+            <w:pPr>
+              <w:pStyle w:val="Single"/>
+            </w:pPr>
+            <w:r>
+              <w:t xml:space="preserve">Vidhu</w:t>
+            </w:r>
+            <w:r>
+              <w:t xml:space="preserve"> </w:t>
+            </w:r>
+            <w:r>
+              <w:t xml:space="preserve">B.</w:t>
+            </w:r>
+            <w:r>
+              <w:t xml:space="preserve"> </w:t>
+            </w:r>
+            <w:r>
+              <w:t xml:space="preserve">Joshi</w:t>
+            </w:r>
+            <w:r>
+              <w:t xml:space="preserve"> </w:t>
+            </w:r>
+            <w:r>
+              <w:t xml:space="preserve">(No. 7608)</w:t>
+            </w:r>
+          </w:p>
+          <w:p>
+            <w:pPr>
+              <w:pStyle w:val="Single"/>
+            </w:pPr>
+            <w:r>
+              <w:t xml:space="preserve">222</w:t>
+            </w:r>
+            <w:r>
+              <w:t xml:space="preserve"> </w:t>
+            </w:r>
+            <w:r>
+              <w:t xml:space="preserve">Delaware</w:t>
+            </w:r>
+            <w:r>
+              <w:t xml:space="preserve"> </w:t>
+            </w:r>
+            <w:r>
+              <w:t xml:space="preserve">Avenue,</w:t>
+            </w:r>
+            <w:r>
+              <w:t xml:space="preserve"> </w:t>
+            </w:r>
+            <w:r>
+              <w:t xml:space="preserve">17th</w:t>
+            </w:r>
+            <w:r>
+              <w:t xml:space="preserve"> </w:t>
+            </w:r>
+            <w:r>
+              <w:t xml:space="preserve">Floor</w:t>
+            </w:r>
+          </w:p>
+          <w:p>
+            <w:pPr>
+              <w:pStyle w:val="Single"/>
+            </w:pPr>
+            <w:r>
+              <w:t xml:space="preserve">Wilmington,</w:t>
+            </w:r>
+            <w:r>
+              <w:t xml:space="preserve"> </w:t>
+            </w:r>
+            <w:r>
+              <w:t xml:space="preserve">DE</w:t>
+            </w:r>
+            <w:r>
+              <w:t xml:space="preserve"> </w:t>
+            </w:r>
+            <w:r>
+              <w:t xml:space="preserve">19801</w:t>
+            </w:r>
+          </w:p>
+          <w:p>
+            <w:pPr>
+              <w:pStyle w:val="Single"/>
+            </w:pPr>
+            <w:r>
+              <w:t xml:space="preserve">(302)</w:t>
+            </w:r>
+            <w:r>
+              <w:t xml:space="preserve"> </w:t>
+            </w:r>
+            <w:r>
+              <w:t xml:space="preserve">652-5070</w:t>
+            </w:r>
+          </w:p>
+          <w:p>
+            <w:pPr>
+              <w:pStyle w:val="Single"/>
+            </w:pPr>
+            <w:r>
+              <w:t xml:space="preserve">hufnal@fr.com;</w:t>
+            </w:r>
+            <w:r>
+              <w:t xml:space="preserve"> </w:t>
+            </w:r>
+            <w:r>
+              <w:t xml:space="preserve">dmccann@fr.com;</w:t>
+            </w:r>
+          </w:p>
+          <w:p>
+            <w:pPr>
+              <w:pStyle w:val="Single"/>
+            </w:pPr>
+            <w:r>
+              <w:t xml:space="preserve">fiorella@fr.com;</w:t>
+            </w:r>
+            <w:r>
+              <w:t xml:space="preserve"> </w:t>
+            </w:r>
+            <w:r>
+              <w:t xml:space="preserve">joshi@fr.com</w:t>
+            </w:r>
+          </w:p>
+          <w:p>
+            <w:pPr>
+              <w:pStyle w:val="Single"/>
+            </w:pPr>
+          </w:p>
+          <w:p>
+            <w:pPr>
+              <w:pStyle w:val="Single"/>
+            </w:pPr>
+            <w:r>
+              <w:t xml:space="preserve">Todd</w:t>
+            </w:r>
+            <w:r>
+              <w:t xml:space="preserve"> </w:t>
+            </w:r>
+            <w:r>
+              <w:t xml:space="preserve">Miller</w:t>
+            </w:r>
+            <w:r>
+              <w:t xml:space="preserve"> </w:t>
+            </w:r>
+            <w:r>
+              <w:t xml:space="preserve">(</w:t>
             </w:r>
             <w:r>
               <w:rPr>
                 <w:i/>
                 <w:iCs/>
               </w:rPr>
-              <w:t xml:space="preserve">hac</w:t>
+              <w:t xml:space="preserve">pro</w:t>
             </w:r>
             <w:r>
               <w:rPr>
@@ -1292,177 +1348,54 @@
                 <w:i/>
                 <w:iCs/>
               </w:rPr>
-              <w:t xml:space="preserve">vice</w:t>
-            </w:r>
-            <w:r>
-              <w:t xml:space="preserve"> </w:t>
-            </w:r>
-            <w:r>
-              <w:t xml:space="preserve">forthcoming)</w:t>
-            </w:r>
-          </w:p>
-          <w:p>
-            <w:pPr>
-              <w:pStyle w:val="Single"/>
-            </w:pPr>
-            <w:r>
-              <w:t xml:space="preserve">FISH</w:t>
-            </w:r>
-            <w:r>
-              <w:t xml:space="preserve"> </w:t>
-            </w:r>
-            <w:r>
-              <w:t xml:space="preserve">&amp;</w:t>
-            </w:r>
-            <w:r>
-              <w:t xml:space="preserve"> </w:t>
-            </w:r>
-            <w:r>
-              <w:t xml:space="preserve">RICHARDSON</w:t>
-            </w:r>
-            <w:r>
-              <w:t xml:space="preserve"> </w:t>
-            </w:r>
-            <w:r>
-              <w:t xml:space="preserve">P.C.</w:t>
-            </w:r>
-          </w:p>
-          <w:p>
-            <w:pPr>
-              <w:pStyle w:val="Single"/>
-            </w:pPr>
-            <w:r>
-              <w:t xml:space="preserve">12860</w:t>
-            </w:r>
-            <w:r>
-              <w:t xml:space="preserve"> </w:t>
-            </w:r>
-            <w:r>
-              <w:t xml:space="preserve">El</w:t>
-            </w:r>
-            <w:r>
-              <w:t xml:space="preserve"> </w:t>
-            </w:r>
-            <w:r>
-              <w:t xml:space="preserve">Camino</w:t>
-            </w:r>
-            <w:r>
-              <w:t xml:space="preserve"> </w:t>
-            </w:r>
-            <w:r>
-              <w:t xml:space="preserve">Real,</w:t>
-            </w:r>
-            <w:r>
-              <w:t xml:space="preserve"> </w:t>
-            </w:r>
-            <w:r>
-              <w:t xml:space="preserve">Suite</w:t>
-            </w:r>
-            <w:r>
-              <w:t xml:space="preserve"> </w:t>
-            </w:r>
-            <w:r>
-              <w:t xml:space="preserve">400</w:t>
-            </w:r>
-          </w:p>
-          <w:p>
-            <w:pPr>
-              <w:pStyle w:val="Single"/>
-            </w:pPr>
-            <w:r>
-              <w:t xml:space="preserve">San</w:t>
-            </w:r>
-            <w:r>
-              <w:t xml:space="preserve"> </w:t>
-            </w:r>
-            <w:r>
-              <w:t xml:space="preserve">Diego,</w:t>
-            </w:r>
-            <w:r>
-              <w:t xml:space="preserve"> </w:t>
-            </w:r>
-            <w:r>
-              <w:t xml:space="preserve">CA</w:t>
-            </w:r>
-            <w:r>
-              <w:t xml:space="preserve"> </w:t>
-            </w:r>
-            <w:r>
-              <w:t xml:space="preserve">92130</w:t>
-            </w:r>
-          </w:p>
-          <w:p>
-            <w:pPr>
-              <w:pStyle w:val="Single"/>
-            </w:pPr>
-            <w:r>
-              <w:t xml:space="preserve">(858)</w:t>
-            </w:r>
-            <w:r>
-              <w:t xml:space="preserve"> </w:t>
-            </w:r>
-            <w:r>
-              <w:t xml:space="preserve">678-4342</w:t>
-            </w:r>
-          </w:p>
-          <w:p>
-            <w:pPr>
-              <w:pStyle w:val="Single"/>
-            </w:pPr>
-            <w:r>
-              <w:t xml:space="preserve">miller@fr.com;</w:t>
-            </w:r>
-            <w:r>
-              <w:t xml:space="preserve"> </w:t>
-            </w:r>
-            <w:r>
-              <w:t xml:space="preserve">train@fr.com</w:t>
-            </w:r>
-          </w:p>
-          <w:p>
-            <w:pPr>
-              <w:pStyle w:val="Single"/>
-            </w:pPr>
-          </w:p>
-          <w:p>
-            <w:pPr>
-              <w:pStyle w:val="Single"/>
-            </w:pPr>
-            <w:r>
-              <w:t xml:space="preserve">Sarah</w:t>
-            </w:r>
-            <w:r>
-              <w:t xml:space="preserve"> </w:t>
-            </w:r>
-            <w:r>
-              <w:t xml:space="preserve">Jack</w:t>
-            </w:r>
-            <w:r>
-              <w:t xml:space="preserve"> </w:t>
-            </w:r>
-            <w:r>
-              <w:t xml:space="preserve">(</w:t>
+              <w:t xml:space="preserve">hac</w:t>
             </w:r>
             <w:r>
               <w:rPr>
                 <w:i/>
                 <w:iCs/>
               </w:rPr>
-              <w:t xml:space="preserve">pro</w:t>
+              <w:t xml:space="preserve"> </w:t>
             </w:r>
             <w:r>
               <w:rPr>
                 <w:i/>
                 <w:iCs/>
               </w:rPr>
-              <w:t xml:space="preserve"> </w:t>
+              <w:t xml:space="preserve">vice</w:t>
+            </w:r>
+            <w:r>
+              <w:t xml:space="preserve"> </w:t>
+            </w:r>
+            <w:r>
+              <w:t xml:space="preserve">forthcoming)</w:t>
+            </w:r>
+          </w:p>
+          <w:p>
+            <w:pPr>
+              <w:pStyle w:val="Single"/>
+            </w:pPr>
+            <w:r>
+              <w:t xml:space="preserve">Tyler</w:t>
+            </w:r>
+            <w:r>
+              <w:t xml:space="preserve"> </w:t>
+            </w:r>
+            <w:r>
+              <w:t xml:space="preserve">Train</w:t>
+            </w:r>
+            <w:r>
+              <w:t xml:space="preserve"> </w:t>
+            </w:r>
+            <w:r>
+              <w:t xml:space="preserve">(</w:t>
             </w:r>
             <w:r>
               <w:rPr>
                 <w:i/>
                 <w:iCs/>
               </w:rPr>
-              <w:t xml:space="preserve">hac</w:t>
+              <w:t xml:space="preserve">pro</w:t>
             </w:r>
             <w:r>
               <w:rPr>
@@ -1476,54 +1409,205 @@
                 <w:i/>
                 <w:iCs/>
               </w:rPr>
-              <w:t xml:space="preserve">vice</w:t>
-            </w:r>
-            <w:r>
-              <w:t xml:space="preserve"> </w:t>
-            </w:r>
-            <w:r>
-              <w:t xml:space="preserve">forthcoming)</w:t>
-            </w:r>
-          </w:p>
-          <w:p>
-            <w:pPr>
-              <w:pStyle w:val="Single"/>
-            </w:pPr>
-            <w:r>
-              <w:t xml:space="preserve">Alexander</w:t>
-            </w:r>
-            <w:r>
-              <w:t xml:space="preserve"> </w:t>
-            </w:r>
-            <w:r>
-              <w:t xml:space="preserve">Rafferty</w:t>
-            </w:r>
-            <w:r>
-              <w:t xml:space="preserve"> </w:t>
-            </w:r>
-            <w:r>
-              <w:t xml:space="preserve">(</w:t>
+              <w:t xml:space="preserve">hac</w:t>
             </w:r>
             <w:r>
               <w:rPr>
                 <w:i/>
                 <w:iCs/>
               </w:rPr>
-              <w:t xml:space="preserve">pro</w:t>
+              <w:t xml:space="preserve"> </w:t>
             </w:r>
             <w:r>
               <w:rPr>
                 <w:i/>
                 <w:iCs/>
               </w:rPr>
-              <w:t xml:space="preserve"> </w:t>
+              <w:t xml:space="preserve">vice</w:t>
+            </w:r>
+            <w:r>
+              <w:t xml:space="preserve"> </w:t>
+            </w:r>
+            <w:r>
+              <w:t xml:space="preserve">forthcoming)</w:t>
+            </w:r>
+          </w:p>
+          <w:p>
+            <w:pPr>
+              <w:pStyle w:val="Single"/>
+            </w:pPr>
+            <w:r>
+              <w:rPr>
+                <w:b/>
+                <w:bCs/>
+              </w:rPr>
+              <w:t xml:space="preserve">FISH</w:t>
+            </w:r>
+            <w:r>
+              <w:rPr>
+                <w:b/>
+                <w:bCs/>
+              </w:rPr>
+              <w:t xml:space="preserve"> </w:t>
+            </w:r>
+            <w:r>
+              <w:rPr>
+                <w:b/>
+                <w:bCs/>
+              </w:rPr>
+              <w:t xml:space="preserve">&amp;</w:t>
+            </w:r>
+            <w:r>
+              <w:rPr>
+                <w:b/>
+                <w:bCs/>
+              </w:rPr>
+              <w:t xml:space="preserve"> </w:t>
+            </w:r>
+            <w:r>
+              <w:rPr>
+                <w:b/>
+                <w:bCs/>
+              </w:rPr>
+              <w:t xml:space="preserve">RICHARDSON</w:t>
+            </w:r>
+            <w:r>
+              <w:rPr>
+                <w:b/>
+                <w:bCs/>
+              </w:rPr>
+              <w:t xml:space="preserve"> </w:t>
+            </w:r>
+            <w:r>
+              <w:rPr>
+                <w:b/>
+                <w:bCs/>
+              </w:rPr>
+              <w:t xml:space="preserve">P.C.</w:t>
+            </w:r>
+          </w:p>
+          <w:p>
+            <w:pPr>
+              <w:pStyle w:val="Single"/>
+            </w:pPr>
+            <w:r>
+              <w:t xml:space="preserve">12860</w:t>
+            </w:r>
+            <w:r>
+              <w:t xml:space="preserve"> </w:t>
+            </w:r>
+            <w:r>
+              <w:t xml:space="preserve">El</w:t>
+            </w:r>
+            <w:r>
+              <w:t xml:space="preserve"> </w:t>
+            </w:r>
+            <w:r>
+              <w:t xml:space="preserve">Camino</w:t>
+            </w:r>
+            <w:r>
+              <w:t xml:space="preserve"> </w:t>
+            </w:r>
+            <w:r>
+              <w:t xml:space="preserve">Real,</w:t>
+            </w:r>
+            <w:r>
+              <w:t xml:space="preserve"> </w:t>
+            </w:r>
+            <w:r>
+              <w:t xml:space="preserve">Suite</w:t>
+            </w:r>
+            <w:r>
+              <w:t xml:space="preserve"> </w:t>
+            </w:r>
+            <w:r>
+              <w:t xml:space="preserve">400</w:t>
+            </w:r>
+          </w:p>
+          <w:p>
+            <w:pPr>
+              <w:pStyle w:val="Single"/>
+            </w:pPr>
+            <w:r>
+              <w:t xml:space="preserve">San</w:t>
+            </w:r>
+            <w:r>
+              <w:t xml:space="preserve"> </w:t>
+            </w:r>
+            <w:r>
+              <w:t xml:space="preserve">Diego,</w:t>
+            </w:r>
+            <w:r>
+              <w:t xml:space="preserve"> </w:t>
+            </w:r>
+            <w:r>
+              <w:t xml:space="preserve">CA</w:t>
+            </w:r>
+            <w:r>
+              <w:t xml:space="preserve"> </w:t>
+            </w:r>
+            <w:r>
+              <w:t xml:space="preserve">92130</w:t>
+            </w:r>
+          </w:p>
+          <w:p>
+            <w:pPr>
+              <w:pStyle w:val="Single"/>
+            </w:pPr>
+            <w:r>
+              <w:t xml:space="preserve">(858)</w:t>
+            </w:r>
+            <w:r>
+              <w:t xml:space="preserve"> </w:t>
+            </w:r>
+            <w:r>
+              <w:t xml:space="preserve">678-4342</w:t>
+            </w:r>
+          </w:p>
+          <w:p>
+            <w:pPr>
+              <w:pStyle w:val="Single"/>
+            </w:pPr>
+            <w:r>
+              <w:t xml:space="preserve">miller@fr.com;</w:t>
+            </w:r>
+            <w:r>
+              <w:t xml:space="preserve"> </w:t>
+            </w:r>
+            <w:r>
+              <w:t xml:space="preserve">train@fr.com</w:t>
+            </w:r>
+          </w:p>
+          <w:p>
+            <w:pPr>
+              <w:pStyle w:val="Single"/>
+            </w:pPr>
+          </w:p>
+          <w:p>
+            <w:pPr>
+              <w:pStyle w:val="Single"/>
+            </w:pPr>
+            <w:r>
+              <w:t xml:space="preserve">Sarah</w:t>
+            </w:r>
+            <w:r>
+              <w:t xml:space="preserve"> </w:t>
+            </w:r>
+            <w:r>
+              <w:t xml:space="preserve">Jack</w:t>
+            </w:r>
+            <w:r>
+              <w:t xml:space="preserve"> </w:t>
+            </w:r>
+            <w:r>
+              <w:t xml:space="preserve">(</w:t>
             </w:r>
             <w:r>
               <w:rPr>
                 <w:i/>
                 <w:iCs/>
               </w:rPr>
-              <w:t xml:space="preserve">hac</w:t>
+              <w:t xml:space="preserve">pro</w:t>
             </w:r>
             <w:r>
               <w:rPr>
@@ -1537,66 +1621,54 @@
                 <w:i/>
                 <w:iCs/>
               </w:rPr>
-              <w:t xml:space="preserve">vice</w:t>
-            </w:r>
-            <w:r>
-              <w:t xml:space="preserve"> </w:t>
-            </w:r>
-            <w:r>
-              <w:t xml:space="preserve">forthcoming)</w:t>
-            </w:r>
-          </w:p>
-          <w:p>
-            <w:pPr>
-              <w:pStyle w:val="Single"/>
-            </w:pPr>
-            <w:r>
-              <w:t xml:space="preserve">Kellie</w:t>
-            </w:r>
-            <w:r>
-              <w:t xml:space="preserve"> </w:t>
-            </w:r>
-            <w:r>
-              <w:t xml:space="preserve">C.</w:t>
-            </w:r>
-            <w:r>
-              <w:t xml:space="preserve"> </w:t>
-            </w:r>
-            <w:r>
-              <w:t xml:space="preserve">Van</w:t>
-            </w:r>
-            <w:r>
-              <w:t xml:space="preserve"> </w:t>
-            </w:r>
-            <w:r>
-              <w:t xml:space="preserve">Beck</w:t>
-            </w:r>
-            <w:r>
-              <w:t xml:space="preserve"> </w:t>
-            </w:r>
-            <w:r>
-              <w:t xml:space="preserve">(</w:t>
+              <w:t xml:space="preserve">hac</w:t>
             </w:r>
             <w:r>
               <w:rPr>
                 <w:i/>
                 <w:iCs/>
               </w:rPr>
-              <w:t xml:space="preserve">pro</w:t>
+              <w:t xml:space="preserve"> </w:t>
             </w:r>
             <w:r>
               <w:rPr>
                 <w:i/>
                 <w:iCs/>
               </w:rPr>
-              <w:t xml:space="preserve"> </w:t>
+              <w:t xml:space="preserve">vice</w:t>
+            </w:r>
+            <w:r>
+              <w:t xml:space="preserve"> </w:t>
+            </w:r>
+            <w:r>
+              <w:t xml:space="preserve">forthcoming)</w:t>
+            </w:r>
+          </w:p>
+          <w:p>
+            <w:pPr>
+              <w:pStyle w:val="Single"/>
+            </w:pPr>
+            <w:r>
+              <w:t xml:space="preserve">Alexander</w:t>
+            </w:r>
+            <w:r>
+              <w:t xml:space="preserve"> </w:t>
+            </w:r>
+            <w:r>
+              <w:t xml:space="preserve">Rafferty</w:t>
+            </w:r>
+            <w:r>
+              <w:t xml:space="preserve"> </w:t>
+            </w:r>
+            <w:r>
+              <w:t xml:space="preserve">(</w:t>
             </w:r>
             <w:r>
               <w:rPr>
                 <w:i/>
                 <w:iCs/>
               </w:rPr>
-              <w:t xml:space="preserve">hac</w:t>
+              <w:t xml:space="preserve">pro</w:t>
             </w:r>
             <w:r>
               <w:rPr>
@@ -1610,179 +1682,66 @@
                 <w:i/>
                 <w:iCs/>
               </w:rPr>
-              <w:t xml:space="preserve">vice</w:t>
-            </w:r>
-            <w:r>
-              <w:t xml:space="preserve"> </w:t>
-            </w:r>
-            <w:r>
-              <w:t xml:space="preserve">forthcoming)</w:t>
-            </w:r>
-          </w:p>
-          <w:p>
-            <w:pPr>
-              <w:pStyle w:val="Single"/>
-            </w:pPr>
-            <w:r>
-              <w:t xml:space="preserve">FISH</w:t>
-            </w:r>
-            <w:r>
-              <w:t xml:space="preserve"> </w:t>
-            </w:r>
-            <w:r>
-              <w:t xml:space="preserve">&amp;</w:t>
-            </w:r>
-            <w:r>
-              <w:t xml:space="preserve"> </w:t>
-            </w:r>
-            <w:r>
-              <w:t xml:space="preserve">RICHARDSON</w:t>
-            </w:r>
-            <w:r>
-              <w:t xml:space="preserve"> </w:t>
-            </w:r>
-            <w:r>
-              <w:t xml:space="preserve">P.C.</w:t>
-            </w:r>
-          </w:p>
-          <w:p>
-            <w:pPr>
-              <w:pStyle w:val="Single"/>
-            </w:pPr>
-            <w:r>
-              <w:t xml:space="preserve">60</w:t>
-            </w:r>
-            <w:r>
-              <w:t xml:space="preserve"> </w:t>
-            </w:r>
-            <w:r>
-              <w:t xml:space="preserve">South</w:t>
-            </w:r>
-            <w:r>
-              <w:t xml:space="preserve"> </w:t>
-            </w:r>
-            <w:r>
-              <w:t xml:space="preserve">6th</w:t>
-            </w:r>
-            <w:r>
-              <w:t xml:space="preserve"> </w:t>
-            </w:r>
-            <w:r>
-              <w:t xml:space="preserve">Street,</w:t>
-            </w:r>
-            <w:r>
-              <w:t xml:space="preserve"> </w:t>
-            </w:r>
-            <w:r>
-              <w:t xml:space="preserve">Suite</w:t>
-            </w:r>
-            <w:r>
-              <w:t xml:space="preserve"> </w:t>
-            </w:r>
-            <w:r>
-              <w:t xml:space="preserve">3200</w:t>
-            </w:r>
-          </w:p>
-          <w:p>
-            <w:pPr>
-              <w:pStyle w:val="Single"/>
-            </w:pPr>
-            <w:r>
-              <w:t xml:space="preserve">Minneapolis,</w:t>
-            </w:r>
-            <w:r>
-              <w:t xml:space="preserve"> </w:t>
-            </w:r>
-            <w:r>
-              <w:t xml:space="preserve">MN</w:t>
-            </w:r>
-            <w:r>
-              <w:t xml:space="preserve"> </w:t>
-            </w:r>
-            <w:r>
-              <w:t xml:space="preserve">55402</w:t>
-            </w:r>
-          </w:p>
-          <w:p>
-            <w:pPr>
-              <w:pStyle w:val="Single"/>
-            </w:pPr>
-            <w:r>
-              <w:t xml:space="preserve">(612)</w:t>
-            </w:r>
-            <w:r>
-              <w:t xml:space="preserve"> </w:t>
-            </w:r>
-            <w:r>
-              <w:t xml:space="preserve">638-5747</w:t>
-            </w:r>
-          </w:p>
-          <w:p>
-            <w:pPr>
-              <w:pStyle w:val="Single"/>
-            </w:pPr>
-            <w:r>
-              <w:t xml:space="preserve">jack@fr.com;</w:t>
-            </w:r>
-            <w:r>
-              <w:t xml:space="preserve"> </w:t>
-            </w:r>
-            <w:r>
-              <w:t xml:space="preserve">rafferty@fr.com;</w:t>
-            </w:r>
-          </w:p>
-          <w:p>
-            <w:pPr>
-              <w:pStyle w:val="Single"/>
-            </w:pPr>
-            <w:r>
-              <w:t xml:space="preserve">vanbeck@fr.com</w:t>
-            </w:r>
-          </w:p>
-          <w:p>
-            <w:pPr>
-              <w:pStyle w:val="Single"/>
-            </w:pPr>
-          </w:p>
-          <w:p>
-            <w:pPr>
-              <w:pStyle w:val="Single"/>
-            </w:pPr>
-            <w:r>
-              <w:t xml:space="preserve">Meghana</w:t>
-            </w:r>
-            <w:r>
-              <w:t xml:space="preserve"> </w:t>
-            </w:r>
-            <w:r>
-              <w:t xml:space="preserve">Thadani</w:t>
-            </w:r>
-            <w:r>
-              <w:t xml:space="preserve"> </w:t>
-            </w:r>
-            <w:r>
-              <w:t xml:space="preserve">(</w:t>
+              <w:t xml:space="preserve">hac</w:t>
             </w:r>
             <w:r>
               <w:rPr>
                 <w:i/>
                 <w:iCs/>
               </w:rPr>
-              <w:t xml:space="preserve">pro</w:t>
+              <w:t xml:space="preserve"> </w:t>
             </w:r>
             <w:r>
               <w:rPr>
                 <w:i/>
                 <w:iCs/>
               </w:rPr>
-              <w:t xml:space="preserve"> </w:t>
+              <w:t xml:space="preserve">vice</w:t>
+            </w:r>
+            <w:r>
+              <w:t xml:space="preserve"> </w:t>
+            </w:r>
+            <w:r>
+              <w:t xml:space="preserve">forthcoming)</w:t>
+            </w:r>
+          </w:p>
+          <w:p>
+            <w:pPr>
+              <w:pStyle w:val="Single"/>
+            </w:pPr>
+            <w:r>
+              <w:t xml:space="preserve">Kellie</w:t>
+            </w:r>
+            <w:r>
+              <w:t xml:space="preserve"> </w:t>
+            </w:r>
+            <w:r>
+              <w:t xml:space="preserve">C.</w:t>
+            </w:r>
+            <w:r>
+              <w:t xml:space="preserve"> </w:t>
+            </w:r>
+            <w:r>
+              <w:t xml:space="preserve">Van</w:t>
+            </w:r>
+            <w:r>
+              <w:t xml:space="preserve"> </w:t>
+            </w:r>
+            <w:r>
+              <w:t xml:space="preserve">Beck</w:t>
+            </w:r>
+            <w:r>
+              <w:t xml:space="preserve"> </w:t>
+            </w:r>
+            <w:r>
+              <w:t xml:space="preserve">(</w:t>
             </w:r>
             <w:r>
               <w:rPr>
                 <w:i/>
                 <w:iCs/>
               </w:rPr>
-              <w:t xml:space="preserve">hac</w:t>
+              <w:t xml:space="preserve">pro</w:t>
             </w:r>
             <w:r>
               <w:rPr>
@@ -1796,6 +1755,20 @@
                 <w:i/>
                 <w:iCs/>
               </w:rPr>
+              <w:t xml:space="preserve">hac</w:t>
+            </w:r>
+            <w:r>
+              <w:rPr>
+                <w:i/>
+                <w:iCs/>
+              </w:rPr>
+              <w:t xml:space="preserve"> </w:t>
+            </w:r>
+            <w:r>
+              <w:rPr>
+                <w:i/>
+                <w:iCs/>
+              </w:rPr>
               <w:t xml:space="preserve">vice</w:t>
             </w:r>
             <w:r>
@@ -1810,24 +1783,266 @@
               <w:pStyle w:val="Single"/>
             </w:pPr>
             <w:r>
+              <w:rPr>
+                <w:b/>
+                <w:bCs/>
+              </w:rPr>
               <w:t xml:space="preserve">FISH</w:t>
             </w:r>
             <w:r>
-              <w:t xml:space="preserve"> </w:t>
-            </w:r>
-            <w:r>
+              <w:rPr>
+                <w:b/>
+                <w:bCs/>
+              </w:rPr>
+              <w:t xml:space="preserve"> </w:t>
+            </w:r>
+            <w:r>
+              <w:rPr>
+                <w:b/>
+                <w:bCs/>
+              </w:rPr>
               <w:t xml:space="preserve">&amp;</w:t>
             </w:r>
             <w:r>
-              <w:t xml:space="preserve"> </w:t>
-            </w:r>
-            <w:r>
+              <w:rPr>
+                <w:b/>
+                <w:bCs/>
+              </w:rPr>
+              <w:t xml:space="preserve"> </w:t>
+            </w:r>
+            <w:r>
+              <w:rPr>
+                <w:b/>
+                <w:bCs/>
+              </w:rPr>
               <w:t xml:space="preserve">RICHARDSON</w:t>
             </w:r>
             <w:r>
-              <w:t xml:space="preserve"> </w:t>
-            </w:r>
-            <w:r>
+              <w:rPr>
+                <w:b/>
+                <w:bCs/>
+              </w:rPr>
+              <w:t xml:space="preserve"> </w:t>
+            </w:r>
+            <w:r>
+              <w:rPr>
+                <w:b/>
+                <w:bCs/>
+              </w:rPr>
+              <w:t xml:space="preserve">P.C.</w:t>
+            </w:r>
+          </w:p>
+          <w:p>
+            <w:pPr>
+              <w:pStyle w:val="Single"/>
+            </w:pPr>
+            <w:r>
+              <w:t xml:space="preserve">60</w:t>
+            </w:r>
+            <w:r>
+              <w:t xml:space="preserve"> </w:t>
+            </w:r>
+            <w:r>
+              <w:t xml:space="preserve">South</w:t>
+            </w:r>
+            <w:r>
+              <w:t xml:space="preserve"> </w:t>
+            </w:r>
+            <w:r>
+              <w:t xml:space="preserve">6th</w:t>
+            </w:r>
+            <w:r>
+              <w:t xml:space="preserve"> </w:t>
+            </w:r>
+            <w:r>
+              <w:t xml:space="preserve">Street,</w:t>
+            </w:r>
+            <w:r>
+              <w:t xml:space="preserve"> </w:t>
+            </w:r>
+            <w:r>
+              <w:t xml:space="preserve">Suite</w:t>
+            </w:r>
+            <w:r>
+              <w:t xml:space="preserve"> </w:t>
+            </w:r>
+            <w:r>
+              <w:t xml:space="preserve">3200</w:t>
+            </w:r>
+          </w:p>
+          <w:p>
+            <w:pPr>
+              <w:pStyle w:val="Single"/>
+            </w:pPr>
+            <w:r>
+              <w:t xml:space="preserve">Minneapolis,</w:t>
+            </w:r>
+            <w:r>
+              <w:t xml:space="preserve"> </w:t>
+            </w:r>
+            <w:r>
+              <w:t xml:space="preserve">MN</w:t>
+            </w:r>
+            <w:r>
+              <w:t xml:space="preserve"> </w:t>
+            </w:r>
+            <w:r>
+              <w:t xml:space="preserve">55402</w:t>
+            </w:r>
+          </w:p>
+          <w:p>
+            <w:pPr>
+              <w:pStyle w:val="Single"/>
+            </w:pPr>
+            <w:r>
+              <w:t xml:space="preserve">(612)</w:t>
+            </w:r>
+            <w:r>
+              <w:t xml:space="preserve"> </w:t>
+            </w:r>
+            <w:r>
+              <w:t xml:space="preserve">638-5747</w:t>
+            </w:r>
+          </w:p>
+          <w:p>
+            <w:pPr>
+              <w:pStyle w:val="Single"/>
+            </w:pPr>
+            <w:r>
+              <w:t xml:space="preserve">jack@fr.com;</w:t>
+            </w:r>
+            <w:r>
+              <w:t xml:space="preserve"> </w:t>
+            </w:r>
+            <w:r>
+              <w:t xml:space="preserve">rafferty@fr.com;</w:t>
+            </w:r>
+          </w:p>
+          <w:p>
+            <w:pPr>
+              <w:pStyle w:val="Single"/>
+            </w:pPr>
+            <w:r>
+              <w:t xml:space="preserve">vanbeck@fr.com</w:t>
+            </w:r>
+          </w:p>
+          <w:p>
+            <w:pPr>
+              <w:pStyle w:val="Single"/>
+            </w:pPr>
+          </w:p>
+          <w:p>
+            <w:pPr>
+              <w:pStyle w:val="Single"/>
+            </w:pPr>
+            <w:r>
+              <w:t xml:space="preserve">Meghana</w:t>
+            </w:r>
+            <w:r>
+              <w:t xml:space="preserve"> </w:t>
+            </w:r>
+            <w:r>
+              <w:t xml:space="preserve">Thadani</w:t>
+            </w:r>
+            <w:r>
+              <w:t xml:space="preserve"> </w:t>
+            </w:r>
+            <w:r>
+              <w:t xml:space="preserve">(</w:t>
+            </w:r>
+            <w:r>
+              <w:rPr>
+                <w:i/>
+                <w:iCs/>
+              </w:rPr>
+              <w:t xml:space="preserve">pro</w:t>
+            </w:r>
+            <w:r>
+              <w:rPr>
+                <w:i/>
+                <w:iCs/>
+              </w:rPr>
+              <w:t xml:space="preserve"> </w:t>
+            </w:r>
+            <w:r>
+              <w:rPr>
+                <w:i/>
+                <w:iCs/>
+              </w:rPr>
+              <w:t xml:space="preserve">hac</w:t>
+            </w:r>
+            <w:r>
+              <w:rPr>
+                <w:i/>
+                <w:iCs/>
+              </w:rPr>
+              <w:t xml:space="preserve"> </w:t>
+            </w:r>
+            <w:r>
+              <w:rPr>
+                <w:i/>
+                <w:iCs/>
+              </w:rPr>
+              <w:t xml:space="preserve">vice</w:t>
+            </w:r>
+            <w:r>
+              <w:t xml:space="preserve"> </w:t>
+            </w:r>
+            <w:r>
+              <w:t xml:space="preserve">forthcoming)</w:t>
+            </w:r>
+          </w:p>
+          <w:p>
+            <w:pPr>
+              <w:pStyle w:val="Single"/>
+            </w:pPr>
+            <w:r>
+              <w:rPr>
+                <w:b/>
+                <w:bCs/>
+              </w:rPr>
+              <w:t xml:space="preserve">FISH</w:t>
+            </w:r>
+            <w:r>
+              <w:rPr>
+                <w:b/>
+                <w:bCs/>
+              </w:rPr>
+              <w:t xml:space="preserve"> </w:t>
+            </w:r>
+            <w:r>
+              <w:rPr>
+                <w:b/>
+                <w:bCs/>
+              </w:rPr>
+              <w:t xml:space="preserve">&amp;</w:t>
+            </w:r>
+            <w:r>
+              <w:rPr>
+                <w:b/>
+                <w:bCs/>
+              </w:rPr>
+              <w:t xml:space="preserve"> </w:t>
+            </w:r>
+            <w:r>
+              <w:rPr>
+                <w:b/>
+                <w:bCs/>
+              </w:rPr>
+              <w:t xml:space="preserve">RICHARDSON</w:t>
+            </w:r>
+            <w:r>
+              <w:rPr>
+                <w:b/>
+                <w:bCs/>
+              </w:rPr>
+              <w:t xml:space="preserve"> </w:t>
+            </w:r>
+            <w:r>
+              <w:rPr>
+                <w:b/>
+                <w:bCs/>
+              </w:rPr>
               <w:t xml:space="preserve">P.C.</w:t>
             </w:r>
           </w:p>
@@ -1966,24 +2181,52 @@
         <w:ind w:left="4464" w:firstLine="0"/>
       </w:pPr>
       <w:r>
+        <w:rPr>
+          <w:i/>
+          <w:iCs/>
+        </w:rPr>
         <w:t xml:space="preserve">Boston</w:t>
       </w:r>
       <w:r>
-        <w:t xml:space="preserve"> </w:t>
-      </w:r>
-      <w:r>
+        <w:rPr>
+          <w:i/>
+          <w:iCs/>
+        </w:rPr>
+        <w:t xml:space="preserve"> </w:t>
+      </w:r>
+      <w:r>
+        <w:rPr>
+          <w:i/>
+          <w:iCs/>
+        </w:rPr>
         <w:t xml:space="preserve">Scientific</w:t>
       </w:r>
       <w:r>
-        <w:t xml:space="preserve"> </w:t>
-      </w:r>
-      <w:r>
+        <w:rPr>
+          <w:i/>
+          <w:iCs/>
+        </w:rPr>
+        <w:t xml:space="preserve"> </w:t>
+      </w:r>
+      <w:r>
+        <w:rPr>
+          <w:i/>
+          <w:iCs/>
+        </w:rPr>
         <w:t xml:space="preserve">Corporation</w:t>
       </w:r>
       <w:r>
-        <w:t xml:space="preserve"> </w:t>
-      </w:r>
-      <w:r>
+        <w:rPr>
+          <w:i/>
+          <w:iCs/>
+        </w:rPr>
+        <w:t xml:space="preserve"> </w:t>
+      </w:r>
+      <w:r>
+        <w:rPr>
+          <w:i/>
+          <w:iCs/>
+        </w:rPr>
         <w:t xml:space="preserve">and</w:t>
       </w:r>
     </w:p>
@@ -1993,38 +2236,73 @@
         <w:ind w:left="4464" w:firstLine="0"/>
       </w:pPr>
       <w:r>
+        <w:rPr>
+          <w:i/>
+          <w:iCs/>
+        </w:rPr>
         <w:t xml:space="preserve">Boston</w:t>
       </w:r>
       <w:r>
-        <w:t xml:space="preserve"> </w:t>
-      </w:r>
-      <w:r>
+        <w:rPr>
+          <w:i/>
+          <w:iCs/>
+        </w:rPr>
+        <w:t xml:space="preserve"> </w:t>
+      </w:r>
+      <w:r>
+        <w:rPr>
+          <w:i/>
+          <w:iCs/>
+        </w:rPr>
         <w:t xml:space="preserve">Scientific</w:t>
       </w:r>
       <w:r>
-        <w:t xml:space="preserve"> </w:t>
-      </w:r>
-      <w:r>
+        <w:rPr>
+          <w:i/>
+          <w:iCs/>
+        </w:rPr>
+        <w:t xml:space="preserve"> </w:t>
+      </w:r>
+      <w:r>
+        <w:rPr>
+          <w:i/>
+          <w:iCs/>
+        </w:rPr>
         <w:t xml:space="preserve">Medical</w:t>
       </w:r>
       <w:r>
-        <w:t xml:space="preserve"> </w:t>
-      </w:r>
-      <w:r>
+        <w:rPr>
+          <w:i/>
+          <w:iCs/>
+        </w:rPr>
+        <w:t xml:space="preserve"> </w:t>
+      </w:r>
+      <w:r>
+        <w:rPr>
+          <w:i/>
+          <w:iCs/>
+        </w:rPr>
         <w:t xml:space="preserve">Device</w:t>
       </w:r>
       <w:r>
-        <w:t xml:space="preserve"> </w:t>
-      </w:r>
-      <w:r>
+        <w:rPr>
+          <w:i/>
+          <w:iCs/>
+        </w:rPr>
+        <w:t xml:space="preserve"> </w:t>
+      </w:r>
+      <w:r>
+        <w:rPr>
+          <w:i/>
+          <w:iCs/>
+        </w:rPr>
         <w:t xml:space="preserve">Limited</w:t>
       </w:r>
     </w:p>
-    <w:bookmarkEnd w:id="27"/>
     <w:sectPr>
-      <w:footerReference r:id="rId9" w:type="default"/>
-      <w:pgSz w:h="15840" w:w="12240"/>
-      <w:pgMar w:bottom="1440" w:footer="720" w:gutter="0" w:header="720" w:left="1440" w:right="1440" w:top="1440"/>
+      <w:footerReference w:type="default" r:id="rId100"/>
+      <w:pgSz w:w="12240" w:h="15840"/>
+      <w:pgMar w:top="1440" w:right="1440" w:bottom="1440" w:left="1440" w:header="720" w:footer="720" w:gutter="0"/>
       <w:pgNumType w:fmt="decimal" w:start="1"/>
     </w:sectPr>
   </w:body>
@@ -2092,7 +2370,7 @@
       </w:r>
     </w:p>
   </w:footnote>
-  <w:footnote w:id="24">
+  <w:footnote w:id="114">
     <w:p>
       <w:pPr>
         <w:pStyle w:val="FootnoteText"/>
@@ -2203,50 +2481,50 @@
   <w:docDefaults>
     <w:rPrDefault>
       <w:rPr>
-        <w:rFonts w:ascii="EB Garamond" w:cs="EB Garamond" w:eastAsia="EB Garamond" w:hAnsi="EB Garamond"/>
+        <w:rFonts w:ascii="EB Garamond" w:hAnsi="EB Garamond" w:eastAsia="EB Garamond" w:cs="EB Garamond"/>
         <w:sz w:val="26"/>
         <w:szCs w:val="26"/>
-        <w:lang w:bidi="ar-SA" w:eastAsia="en-US" w:val="en-US"/>
+        <w:lang w:val="en-US" w:eastAsia="en-US" w:bidi="ar-SA"/>
       </w:rPr>
     </w:rPrDefault>
     <w:pPrDefault>
       <w:pPr>
-        <w:spacing w:after="0" w:before="0" w:line="240" w:lineRule="auto"/>
+        <w:spacing w:before="0" w:after="0" w:line="240" w:lineRule="auto"/>
       </w:pPr>
     </w:pPrDefault>
   </w:docDefaults>
-  <w:latentStyles w:count="276" w:defLockedState="0" w:defQFormat="0" w:defSemiHidden="0" w:defUIPriority="0" w:defUnhideWhenUsed="0"/>
-  <w:style w:styleId="Normal" w:type="paragraph">
+  <w:latentStyles w:defLockedState="0" w:defUIPriority="0" w:defSemiHidden="0" w:defUnhideWhenUsed="0" w:defQFormat="0" w:count="276"/>
+  <w:style w:type="paragraph" w:styleId="Normal">
     <w:name w:val="Normal"/>
     <w:qFormat/>
     <w:pPr>
-      <w:spacing w:after="0" w:before="0" w:line="240" w:lineRule="auto"/>
+      <w:spacing w:before="0" w:after="0" w:line="240" w:lineRule="auto"/>
     </w:pPr>
   </w:style>
-  <w:style w:styleId="BodyText" w:type="paragraph">
+  <w:style w:type="paragraph" w:styleId="BodyText">
     <w:name w:val="Body Text"/>
     <w:basedOn w:val="Normal"/>
     <w:qFormat/>
     <w:pPr>
-      <w:spacing w:after="0" w:before="0" w:line="540" w:lineRule="exact"/>
+      <w:spacing w:before="0" w:after="0" w:line="540" w:lineRule="exact"/>
       <w:ind w:firstLine="720"/>
     </w:pPr>
   </w:style>
-  <w:style w:styleId="FirstParagraph" w:type="paragraph">
+  <w:style w:type="paragraph" w:styleId="FirstParagraph">
     <w:name w:val="First Paragraph"/>
     <w:basedOn w:val="BodyText"/>
     <w:qFormat/>
   </w:style>
-  <w:style w:styleId="Compact" w:type="paragraph">
+  <w:style w:type="paragraph" w:styleId="Compact">
     <w:name w:val="Compact"/>
     <w:basedOn w:val="BodyText"/>
     <w:qFormat/>
     <w:pPr>
-      <w:spacing w:after="0" w:before="0" w:line="540" w:lineRule="exact"/>
+      <w:spacing w:before="0" w:after="0" w:line="540" w:lineRule="exact"/>
       <w:ind w:firstLine="0"/>
     </w:pPr>
   </w:style>
-  <w:style w:styleId="Title" w:type="paragraph">
+  <w:style w:type="paragraph" w:styleId="Title">
     <w:name w:val="Title"/>
     <w:basedOn w:val="Normal"/>
     <w:next w:val="BodyText"/>
@@ -2260,24 +2538,24 @@
       <w:jc w:val="center"/>
     </w:pPr>
     <w:rPr>
-      <w:rFonts w:asciiTheme="majorHAnsi" w:cstheme="majorBidi" w:eastAsiaTheme="majorEastAsia" w:hAnsiTheme="majorHAnsi"/>
+      <w:rFonts w:asciiTheme="majorHAnsi" w:eastAsiaTheme="majorEastAsia" w:hAnsiTheme="majorHAnsi" w:cstheme="majorBidi"/>
       <w:sz w:val="56"/>
       <w:szCs w:val="56"/>
     </w:rPr>
   </w:style>
-  <w:style w:customStyle="1" w:styleId="TitleChar" w:type="character">
+  <w:style w:type="character" w:customStyle="1" w:styleId="TitleChar">
     <w:name w:val="Title Char"/>
     <w:basedOn w:val="DefaultParagraphFont"/>
     <w:link w:val="Title"/>
     <w:uiPriority w:val="10"/>
     <w:rsid w:val="00A10FD9"/>
     <w:rPr>
-      <w:rFonts w:asciiTheme="majorHAnsi" w:cstheme="majorBidi" w:eastAsiaTheme="majorEastAsia" w:hAnsiTheme="majorHAnsi"/>
+      <w:rFonts w:asciiTheme="majorHAnsi" w:eastAsiaTheme="majorEastAsia" w:hAnsiTheme="majorHAnsi" w:cstheme="majorBidi"/>
       <w:sz w:val="56"/>
       <w:szCs w:val="56"/>
     </w:rPr>
   </w:style>
-  <w:style w:styleId="Subtitle" w:type="paragraph">
+  <w:style w:type="paragraph" w:styleId="Subtitle">
     <w:name w:val="Subtitle"/>
     <w:basedOn w:val="Title"/>
     <w:next w:val="BodyText"/>
@@ -2291,27 +2569,27 @@
       </w:numPr>
     </w:pPr>
     <w:rPr>
-      <w:rFonts w:cstheme="majorBidi" w:eastAsiaTheme="majorEastAsia"/>
+      <w:rFonts w:eastAsiaTheme="majorEastAsia" w:cstheme="majorBidi"/>
       <w:spacing w:val="15"/>
       <w:sz w:val="28"/>
       <w:szCs w:val="28"/>
     </w:rPr>
   </w:style>
-  <w:style w:customStyle="1" w:styleId="SubtitleChar" w:type="character">
+  <w:style w:type="character" w:customStyle="1" w:styleId="SubtitleChar">
     <w:name w:val="Subtitle Char"/>
     <w:basedOn w:val="DefaultParagraphFont"/>
     <w:link w:val="Subtitle"/>
     <w:uiPriority w:val="11"/>
     <w:rsid w:val="00A10FD9"/>
     <w:rPr>
-      <w:rFonts w:cstheme="majorBidi" w:eastAsiaTheme="majorEastAsia"/>
-      <w:color w:themeColor="text1" w:themeTint="A6" w:val="595959"/>
+      <w:rFonts w:eastAsiaTheme="majorEastAsia" w:cstheme="majorBidi"/>
+      <w:color w:val="595959" w:themeColor="text1" w:themeTint="A6"/>
       <w:spacing w:val="15"/>
       <w:sz w:val="28"/>
       <w:szCs w:val="28"/>
     </w:rPr>
   </w:style>
-  <w:style w:customStyle="1" w:styleId="Author" w:type="paragraph">
+  <w:style w:type="paragraph" w:customStyle="1" w:styleId="Author">
     <w:name w:val="Author"/>
     <w:basedOn w:val="Title"/>
     <w:next w:val="BodyText"/>
@@ -2325,7 +2603,7 @@
       <w:szCs w:val="24"/>
     </w:rPr>
   </w:style>
-  <w:style w:styleId="Date" w:type="paragraph">
+  <w:style w:type="paragraph" w:styleId="Date">
     <w:name w:val="Date"/>
     <w:basedOn w:val="Title"/>
     <w:next w:val="BodyText"/>
@@ -2339,7 +2617,7 @@
       <w:szCs w:val="24"/>
     </w:rPr>
   </w:style>
-  <w:style w:customStyle="1" w:styleId="AbstractTitle" w:type="paragraph">
+  <w:style w:type="paragraph" w:customStyle="1" w:styleId="AbstractTitle">
     <w:name w:val="Abstract Title"/>
     <w:basedOn w:val="Normal"/>
     <w:next w:val="Abstract"/>
@@ -2347,7 +2625,7 @@
     <w:pPr>
       <w:keepNext/>
       <w:keepLines/>
-      <w:spacing w:after="0" w:before="300"/>
+      <w:spacing w:before="300" w:after="0"/>
       <w:jc w:val="center"/>
     </w:pPr>
     <w:rPr>
@@ -2356,7 +2634,7 @@
       <w:szCs w:val="20"/>
     </w:rPr>
   </w:style>
-  <w:style w:customStyle="1" w:styleId="Abstract" w:type="paragraph">
+  <w:style w:type="paragraph" w:customStyle="1" w:styleId="Abstract">
     <w:name w:val="Abstract"/>
     <w:basedOn w:val="Normal"/>
     <w:next w:val="BodyText"/>
@@ -2364,14 +2642,14 @@
     <w:pPr>
       <w:keepNext/>
       <w:keepLines/>
-      <w:spacing w:after="300" w:before="100"/>
+      <w:spacing w:before="100" w:after="300"/>
     </w:pPr>
     <w:rPr>
       <w:sz w:val="20"/>
       <w:szCs w:val="20"/>
     </w:rPr>
   </w:style>
-  <w:style w:styleId="Bibliography" w:type="paragraph">
+  <w:style w:type="paragraph" w:styleId="Bibliography">
     <w:name w:val="Bibliography"/>
     <w:basedOn w:val="Normal"/>
     <w:next w:val="Bibliography"/>
@@ -2379,14 +2657,14 @@
     <w:pPr/>
     <w:rPr/>
   </w:style>
-  <w:style w:styleId="Heading1" w:type="paragraph">
+  <w:style w:type="paragraph" w:styleId="Heading1">
     <w:name w:val="heading 1"/>
     <w:basedOn w:val="Normal"/>
     <w:qFormat/>
     <w:pPr>
       <w:keepNext/>
       <w:keepLines/>
-      <w:spacing w:after="270" w:before="270" w:line="240" w:lineRule="auto"/>
+      <w:spacing w:before="270" w:after="270" w:line="240" w:lineRule="auto"/>
       <w:ind w:firstLine="0"/>
       <w:jc w:val="center"/>
       <w:outlineLvl w:val="0"/>
@@ -2398,14 +2676,14 @@
       <w:color w:val="000000"/>
     </w:rPr>
   </w:style>
-  <w:style w:styleId="Heading2" w:type="paragraph">
+  <w:style w:type="paragraph" w:styleId="Heading2">
     <w:name w:val="heading 2"/>
     <w:basedOn w:val="Normal"/>
     <w:qFormat/>
     <w:pPr>
       <w:keepNext/>
       <w:keepLines/>
-      <w:spacing w:after="270" w:before="270" w:line="240" w:lineRule="auto"/>
+      <w:spacing w:before="270" w:after="270" w:line="240" w:lineRule="auto"/>
       <w:ind w:firstLine="0"/>
       <w:jc w:val="center"/>
       <w:outlineLvl w:val="1"/>
@@ -2416,14 +2694,14 @@
       <w:color w:val="000000"/>
     </w:rPr>
   </w:style>
-  <w:style w:styleId="Heading3" w:type="paragraph">
+  <w:style w:type="paragraph" w:styleId="Heading3">
     <w:name w:val="heading 3"/>
     <w:basedOn w:val="Normal"/>
     <w:qFormat/>
     <w:pPr>
       <w:keepNext/>
       <w:keepLines/>
-      <w:spacing w:after="270" w:before="270" w:line="240" w:lineRule="auto"/>
+      <w:spacing w:before="270" w:after="270" w:line="240" w:lineRule="auto"/>
       <w:ind w:firstLine="0"/>
       <w:jc w:val="left"/>
       <w:outlineLvl w:val="2"/>
@@ -2436,7 +2714,7 @@
       <w:color w:val="000000"/>
     </w:rPr>
   </w:style>
-  <w:style w:styleId="Heading4" w:type="paragraph">
+  <w:style w:type="paragraph" w:styleId="Heading4">
     <w:name w:val="heading 4"/>
     <w:basedOn w:val="Normal"/>
     <w:next w:val="BodyText"/>
@@ -2449,17 +2727,17 @@
     <w:pPr>
       <w:keepNext/>
       <w:keepLines/>
-      <w:spacing w:after="40" w:before="80"/>
+      <w:spacing w:before="80" w:after="40"/>
       <w:outlineLvl w:val="3"/>
     </w:pPr>
     <w:rPr>
-      <w:rFonts w:cstheme="majorBidi" w:eastAsiaTheme="majorEastAsia"/>
+      <w:rFonts w:eastAsiaTheme="majorEastAsia" w:cstheme="majorBidi"/>
       <w:i/>
       <w:iCs/>
-      <w:color w:themeColor="accent1" w:themeShade="BF" w:val="0F4761"/>
-    </w:rPr>
-  </w:style>
-  <w:style w:styleId="Heading5" w:type="paragraph">
+      <w:color w:val="0F4761" w:themeColor="accent1" w:themeShade="BF"/>
+    </w:rPr>
+  </w:style>
+  <w:style w:type="paragraph" w:styleId="Heading5">
     <w:name w:val="heading 5"/>
     <w:basedOn w:val="Normal"/>
     <w:next w:val="BodyText"/>
@@ -2472,15 +2750,15 @@
     <w:pPr>
       <w:keepNext/>
       <w:keepLines/>
-      <w:spacing w:after="40" w:before="80"/>
+      <w:spacing w:before="80" w:after="40"/>
       <w:outlineLvl w:val="4"/>
     </w:pPr>
     <w:rPr>
-      <w:rFonts w:cstheme="majorBidi" w:eastAsiaTheme="majorEastAsia"/>
-      <w:color w:themeColor="accent1" w:themeShade="BF" w:val="0F4761"/>
-    </w:rPr>
-  </w:style>
-  <w:style w:styleId="Heading6" w:type="paragraph">
+      <w:rFonts w:eastAsiaTheme="majorEastAsia" w:cstheme="majorBidi"/>
+      <w:color w:val="0F4761" w:themeColor="accent1" w:themeShade="BF"/>
+    </w:rPr>
+  </w:style>
+  <w:style w:type="paragraph" w:styleId="Heading6">
     <w:name w:val="heading 6"/>
     <w:basedOn w:val="Normal"/>
     <w:next w:val="BodyText"/>
@@ -2493,17 +2771,17 @@
     <w:pPr>
       <w:keepNext/>
       <w:keepLines/>
-      <w:spacing w:after="0" w:before="40"/>
+      <w:spacing w:before="40" w:after="0"/>
       <w:outlineLvl w:val="5"/>
     </w:pPr>
     <w:rPr>
-      <w:rFonts w:cstheme="majorBidi" w:eastAsiaTheme="majorEastAsia"/>
+      <w:rFonts w:eastAsiaTheme="majorEastAsia" w:cstheme="majorBidi"/>
       <w:i/>
       <w:iCs/>
-      <w:color w:themeColor="text1" w:themeTint="A6" w:val="595959"/>
-    </w:rPr>
-  </w:style>
-  <w:style w:styleId="Heading7" w:type="paragraph">
+      <w:color w:val="595959" w:themeColor="text1" w:themeTint="A6"/>
+    </w:rPr>
+  </w:style>
+  <w:style w:type="paragraph" w:styleId="Heading7">
     <w:name w:val="heading 7"/>
     <w:basedOn w:val="Normal"/>
     <w:next w:val="BodyText"/>
@@ -2516,15 +2794,15 @@
     <w:pPr>
       <w:keepNext/>
       <w:keepLines/>
-      <w:spacing w:after="0" w:before="40"/>
+      <w:spacing w:before="40" w:after="0"/>
       <w:outlineLvl w:val="6"/>
     </w:pPr>
     <w:rPr>
-      <w:rFonts w:cstheme="majorBidi" w:eastAsiaTheme="majorEastAsia"/>
-      <w:color w:themeColor="text1" w:themeTint="A6" w:val="595959"/>
-    </w:rPr>
-  </w:style>
-  <w:style w:styleId="Heading8" w:type="paragraph">
+      <w:rFonts w:eastAsiaTheme="majorEastAsia" w:cstheme="majorBidi"/>
+      <w:color w:val="595959" w:themeColor="text1" w:themeTint="A6"/>
+    </w:rPr>
+  </w:style>
+  <w:style w:type="paragraph" w:styleId="Heading8">
     <w:name w:val="heading 8"/>
     <w:basedOn w:val="Normal"/>
     <w:next w:val="BodyText"/>
@@ -2541,13 +2819,13 @@
       <w:outlineLvl w:val="7"/>
     </w:pPr>
     <w:rPr>
-      <w:rFonts w:cstheme="majorBidi" w:eastAsiaTheme="majorEastAsia"/>
+      <w:rFonts w:eastAsiaTheme="majorEastAsia" w:cstheme="majorBidi"/>
       <w:i/>
       <w:iCs/>
-      <w:color w:themeColor="text1" w:themeTint="D8" w:val="272727"/>
-    </w:rPr>
-  </w:style>
-  <w:style w:styleId="Heading9" w:type="paragraph">
+      <w:color w:val="272727" w:themeColor="text1" w:themeTint="D8"/>
+    </w:rPr>
+  </w:style>
+  <w:style w:type="paragraph" w:styleId="Heading9">
     <w:name w:val="heading 9"/>
     <w:basedOn w:val="Normal"/>
     <w:next w:val="BodyText"/>
@@ -2564,24 +2842,24 @@
       <w:outlineLvl w:val="8"/>
     </w:pPr>
     <w:rPr>
-      <w:rFonts w:cstheme="majorBidi" w:eastAsiaTheme="majorEastAsia"/>
-      <w:color w:themeColor="text1" w:themeTint="D8" w:val="272727"/>
-    </w:rPr>
-  </w:style>
-  <w:style w:customStyle="1" w:styleId="Heading1Char" w:type="character">
+      <w:rFonts w:eastAsiaTheme="majorEastAsia" w:cstheme="majorBidi"/>
+      <w:color w:val="272727" w:themeColor="text1" w:themeTint="D8"/>
+    </w:rPr>
+  </w:style>
+  <w:style w:type="character" w:customStyle="1" w:styleId="Heading1Char">
     <w:name w:val="Heading 1 Char"/>
     <w:basedOn w:val="DefaultParagraphFont"/>
     <w:link w:val="Heading1"/>
     <w:uiPriority w:val="9"/>
     <w:rsid w:val="00A10FD9"/>
     <w:rPr>
-      <w:rFonts w:asciiTheme="majorHAnsi" w:cstheme="majorBidi" w:eastAsiaTheme="majorEastAsia" w:hAnsiTheme="majorHAnsi"/>
-      <w:color w:themeColor="accent1" w:themeShade="BF" w:val="0F4761"/>
+      <w:rFonts w:asciiTheme="majorHAnsi" w:eastAsiaTheme="majorEastAsia" w:hAnsiTheme="majorHAnsi" w:cstheme="majorBidi"/>
+      <w:color w:val="0F4761" w:themeColor="accent1" w:themeShade="BF"/>
       <w:sz w:val="40"/>
       <w:szCs w:val="40"/>
     </w:rPr>
   </w:style>
-  <w:style w:customStyle="1" w:styleId="Heading2Char" w:type="character">
+  <w:style w:type="character" w:customStyle="1" w:styleId="Heading2Char">
     <w:name w:val="Heading 2 Char"/>
     <w:basedOn w:val="DefaultParagraphFont"/>
     <w:link w:val="Heading2"/>
@@ -2589,13 +2867,13 @@
     <w:semiHidden/>
     <w:rsid w:val="00A10FD9"/>
     <w:rPr>
-      <w:rFonts w:asciiTheme="majorHAnsi" w:cstheme="majorBidi" w:eastAsiaTheme="majorEastAsia" w:hAnsiTheme="majorHAnsi"/>
-      <w:color w:themeColor="accent1" w:themeShade="BF" w:val="0F4761"/>
+      <w:rFonts w:asciiTheme="majorHAnsi" w:eastAsiaTheme="majorEastAsia" w:hAnsiTheme="majorHAnsi" w:cstheme="majorBidi"/>
+      <w:color w:val="0F4761" w:themeColor="accent1" w:themeShade="BF"/>
       <w:sz w:val="32"/>
       <w:szCs w:val="32"/>
     </w:rPr>
   </w:style>
-  <w:style w:customStyle="1" w:styleId="Heading3Char" w:type="character">
+  <w:style w:type="character" w:customStyle="1" w:styleId="Heading3Char">
     <w:name w:val="Heading 3 Char"/>
     <w:basedOn w:val="DefaultParagraphFont"/>
     <w:link w:val="Heading3"/>
@@ -2603,13 +2881,13 @@
     <w:semiHidden/>
     <w:rsid w:val="00A10FD9"/>
     <w:rPr>
-      <w:rFonts w:cstheme="majorBidi" w:eastAsiaTheme="majorEastAsia"/>
-      <w:color w:themeColor="accent1" w:themeShade="BF" w:val="0F4761"/>
+      <w:rFonts w:eastAsiaTheme="majorEastAsia" w:cstheme="majorBidi"/>
+      <w:color w:val="0F4761" w:themeColor="accent1" w:themeShade="BF"/>
       <w:sz w:val="28"/>
       <w:szCs w:val="28"/>
     </w:rPr>
   </w:style>
-  <w:style w:customStyle="1" w:styleId="Heading4Char" w:type="character">
+  <w:style w:type="character" w:customStyle="1" w:styleId="Heading4Char">
     <w:name w:val="Heading 4 Char"/>
     <w:basedOn w:val="DefaultParagraphFont"/>
     <w:link w:val="Heading4"/>
@@ -2617,13 +2895,13 @@
     <w:semiHidden/>
     <w:rsid w:val="00A10FD9"/>
     <w:rPr>
-      <w:rFonts w:cstheme="majorBidi" w:eastAsiaTheme="majorEastAsia"/>
+      <w:rFonts w:eastAsiaTheme="majorEastAsia" w:cstheme="majorBidi"/>
       <w:i/>
       <w:iCs/>
-      <w:color w:themeColor="accent1" w:themeShade="BF" w:val="0F4761"/>
-    </w:rPr>
-  </w:style>
-  <w:style w:customStyle="1" w:styleId="Heading5Char" w:type="character">
+      <w:color w:val="0F4761" w:themeColor="accent1" w:themeShade="BF"/>
+    </w:rPr>
+  </w:style>
+  <w:style w:type="character" w:customStyle="1" w:styleId="Heading5Char">
     <w:name w:val="Heading 5 Char"/>
     <w:basedOn w:val="DefaultParagraphFont"/>
     <w:link w:val="Heading5"/>
@@ -2631,11 +2909,11 @@
     <w:semiHidden/>
     <w:rsid w:val="00A10FD9"/>
     <w:rPr>
-      <w:rFonts w:cstheme="majorBidi" w:eastAsiaTheme="majorEastAsia"/>
-      <w:color w:themeColor="accent1" w:themeShade="BF" w:val="0F4761"/>
-    </w:rPr>
-  </w:style>
-  <w:style w:customStyle="1" w:styleId="Heading6Char" w:type="character">
+      <w:rFonts w:eastAsiaTheme="majorEastAsia" w:cstheme="majorBidi"/>
+      <w:color w:val="0F4761" w:themeColor="accent1" w:themeShade="BF"/>
+    </w:rPr>
+  </w:style>
+  <w:style w:type="character" w:customStyle="1" w:styleId="Heading6Char">
     <w:name w:val="Heading 6 Char"/>
     <w:basedOn w:val="DefaultParagraphFont"/>
     <w:link w:val="Heading6"/>
@@ -2643,13 +2921,13 @@
     <w:semiHidden/>
     <w:rsid w:val="00A10FD9"/>
     <w:rPr>
-      <w:rFonts w:cstheme="majorBidi" w:eastAsiaTheme="majorEastAsia"/>
+      <w:rFonts w:eastAsiaTheme="majorEastAsia" w:cstheme="majorBidi"/>
       <w:i/>
       <w:iCs/>
-      <w:color w:themeColor="text1" w:themeTint="A6" w:val="595959"/>
-    </w:rPr>
-  </w:style>
-  <w:style w:customStyle="1" w:styleId="Heading7Char" w:type="character">
+      <w:color w:val="595959" w:themeColor="text1" w:themeTint="A6"/>
+    </w:rPr>
+  </w:style>
+  <w:style w:type="character" w:customStyle="1" w:styleId="Heading7Char">
     <w:name w:val="Heading 7 Char"/>
     <w:basedOn w:val="DefaultParagraphFont"/>
     <w:link w:val="Heading7"/>
@@ -2657,11 +2935,11 @@
     <w:semiHidden/>
     <w:rsid w:val="00A10FD9"/>
     <w:rPr>
-      <w:rFonts w:cstheme="majorBidi" w:eastAsiaTheme="majorEastAsia"/>
-      <w:color w:themeColor="text1" w:themeTint="A6" w:val="595959"/>
-    </w:rPr>
-  </w:style>
-  <w:style w:customStyle="1" w:styleId="Heading8Char" w:type="character">
+      <w:rFonts w:eastAsiaTheme="majorEastAsia" w:cstheme="majorBidi"/>
+      <w:color w:val="595959" w:themeColor="text1" w:themeTint="A6"/>
+    </w:rPr>
+  </w:style>
+  <w:style w:type="character" w:customStyle="1" w:styleId="Heading8Char">
     <w:name w:val="Heading 8 Char"/>
     <w:basedOn w:val="DefaultParagraphFont"/>
     <w:link w:val="Heading8"/>
@@ -2669,13 +2947,13 @@
     <w:semiHidden/>
     <w:rsid w:val="00A10FD9"/>
     <w:rPr>
-      <w:rFonts w:cstheme="majorBidi" w:eastAsiaTheme="majorEastAsia"/>
+      <w:rFonts w:eastAsiaTheme="majorEastAsia" w:cstheme="majorBidi"/>
       <w:i/>
       <w:iCs/>
-      <w:color w:themeColor="text1" w:themeTint="D8" w:val="272727"/>
-    </w:rPr>
-  </w:style>
-  <w:style w:customStyle="1" w:styleId="Heading9Char" w:type="character">
+      <w:color w:val="272727" w:themeColor="text1" w:themeTint="D8"/>
+    </w:rPr>
+  </w:style>
+  <w:style w:type="character" w:customStyle="1" w:styleId="Heading9Char">
     <w:name w:val="Heading 9 Char"/>
     <w:basedOn w:val="DefaultParagraphFont"/>
     <w:link w:val="Heading9"/>
@@ -2683,25 +2961,25 @@
     <w:semiHidden/>
     <w:rsid w:val="00A10FD9"/>
     <w:rPr>
-      <w:rFonts w:cstheme="majorBidi" w:eastAsiaTheme="majorEastAsia"/>
-      <w:color w:themeColor="text1" w:themeTint="D8" w:val="272727"/>
-    </w:rPr>
-  </w:style>
-  <w:style w:styleId="BlockText" w:type="paragraph">
+      <w:rFonts w:eastAsiaTheme="majorEastAsia" w:cstheme="majorBidi"/>
+      <w:color w:val="272727" w:themeColor="text1" w:themeTint="D8"/>
+    </w:rPr>
+  </w:style>
+  <w:style w:type="paragraph" w:styleId="BlockText">
     <w:name w:val="Block Text"/>
     <w:basedOn w:val="Normal"/>
     <w:qFormat/>
     <w:pPr>
-      <w:spacing w:after="240" w:before="0" w:line="240" w:lineRule="auto"/>
-      <w:ind w:firstLine="0" w:left="720" w:right="720"/>
+      <w:spacing w:before="0" w:after="240" w:line="240" w:lineRule="auto"/>
+      <w:ind w:left="720" w:right="720" w:firstLine="0"/>
     </w:pPr>
   </w:style>
-  <w:style w:styleId="FootnoteText" w:type="paragraph">
+  <w:style w:type="paragraph" w:styleId="FootnoteText">
     <w:name w:val="footnote text"/>
     <w:basedOn w:val="Normal"/>
     <w:qFormat/>
     <w:pPr>
-      <w:spacing w:after="100" w:before="0" w:line="240" w:lineRule="auto"/>
+      <w:spacing w:before="0" w:after="100" w:line="240" w:lineRule="auto"/>
       <w:ind w:firstLine="0"/>
     </w:pPr>
     <w:rPr>
@@ -2709,7 +2987,7 @@
       <w:szCs w:val="26"/>
     </w:rPr>
   </w:style>
-  <w:style w:styleId="FootnoteBlockText" w:type="paragraph">
+  <w:style w:type="paragraph" w:styleId="FootnoteBlockText">
     <w:name w:val="Footnote Block Text"/>
     <w:basedOn w:val="FootnoteText"/>
     <w:next w:val="FootnoteText"/>
@@ -2717,34 +2995,34 @@
     <w:unhideWhenUsed/>
     <w:qFormat/>
     <w:pPr>
-      <w:spacing w:after="100" w:before="100"/>
+      <w:spacing w:before="100" w:after="100"/>
       <w:ind w:firstLine="0" w:left="480" w:right="480"/>
     </w:pPr>
   </w:style>
-  <w:style w:default="1" w:styleId="DefaultParagraphFont" w:type="character">
+  <w:style w:type="character" w:default="1" w:styleId="DefaultParagraphFont">
     <w:name w:val="Default Paragraph Font"/>
     <w:semiHidden/>
     <w:unhideWhenUsed/>
   </w:style>
-  <w:style w:default="1" w:styleId="Table" w:type="table">
+  <w:style w:type="table" w:default="1" w:styleId="Table">
     <w:name w:val="Table"/>
     <w:basedOn w:val="TableNormal"/>
     <w:semiHidden/>
     <w:unhideWhenUsed/>
     <w:qFormat/>
     <w:tblPr>
-      <w:tblInd w:type="dxa" w:w="0"/>
+      <w:tblInd w:w="0" w:type="dxa"/>
       <w:tblCellMar>
-        <w:top w:type="dxa" w:w="0"/>
-        <w:left w:type="dxa" w:w="108"/>
-        <w:bottom w:type="dxa" w:w="0"/>
-        <w:right w:type="dxa" w:w="108"/>
+        <w:top w:w="0" w:type="dxa"/>
+        <w:left w:w="108" w:type="dxa"/>
+        <w:bottom w:w="0" w:type="dxa"/>
+        <w:right w:w="108" w:type="dxa"/>
       </w:tblCellMar>
     </w:tblPr>
     <w:tblStylePr w:type="firstRow">
       <w:tblPr>
         <w:jc w:val="left"/>
-        <w:tblInd w:type="dxa" w:w="0"/>
+        <w:tblInd w:w="0" w:type="dxa"/>
       </w:tblPr>
       <w:trPr>
         <w:jc w:val="left"/>
@@ -2757,7 +3035,7 @@
       </w:tcPr>
     </w:tblStylePr>
   </w:style>
-  <w:style w:customStyle="1" w:styleId="DefinitionTerm" w:type="paragraph">
+  <w:style w:type="paragraph" w:customStyle="1" w:styleId="DefinitionTerm">
     <w:name w:val="Definition Term"/>
     <w:basedOn w:val="Normal"/>
     <w:next w:val="Definition"/>
@@ -2770,49 +3048,49 @@
       <w:b/>
     </w:rPr>
   </w:style>
-  <w:style w:customStyle="1" w:styleId="Definition" w:type="paragraph">
+  <w:style w:type="paragraph" w:customStyle="1" w:styleId="Definition">
     <w:name w:val="Definition"/>
     <w:basedOn w:val="Normal"/>
   </w:style>
-  <w:style w:styleId="Caption" w:type="paragraph">
+  <w:style w:type="paragraph" w:styleId="Caption">
     <w:name w:val="Caption"/>
     <w:basedOn w:val="Normal"/>
     <w:link w:val="BodyTextChar"/>
     <w:pPr>
-      <w:spacing w:after="120" w:before="0"/>
+      <w:spacing w:before="0" w:after="120"/>
     </w:pPr>
     <w:rPr>
       <w:i/>
     </w:rPr>
   </w:style>
-  <w:style w:customStyle="1" w:styleId="TableCaption" w:type="paragraph">
+  <w:style w:type="paragraph" w:customStyle="1" w:styleId="TableCaption">
     <w:name w:val="Table Caption"/>
     <w:basedOn w:val="Caption"/>
     <w:pPr>
       <w:keepNext/>
     </w:pPr>
   </w:style>
-  <w:style w:customStyle="1" w:styleId="ImageCaption" w:type="paragraph">
+  <w:style w:type="paragraph" w:customStyle="1" w:styleId="ImageCaption">
     <w:name w:val="Image Caption"/>
     <w:basedOn w:val="Caption"/>
   </w:style>
-  <w:style w:customStyle="1" w:styleId="Figure" w:type="paragraph">
+  <w:style w:type="paragraph" w:customStyle="1" w:styleId="Figure">
     <w:name w:val="Figure"/>
     <w:basedOn w:val="Normal"/>
   </w:style>
-  <w:style w:customStyle="1" w:styleId="CaptionedFigure" w:type="paragraph">
+  <w:style w:type="paragraph" w:customStyle="1" w:styleId="CaptionedFigure">
     <w:name w:val="Captioned Figure"/>
     <w:basedOn w:val="Figure"/>
     <w:pPr>
       <w:keepNext/>
     </w:pPr>
   </w:style>
-  <w:style w:customStyle="1" w:styleId="BodyTextChar" w:type="character">
+  <w:style w:type="character" w:customStyle="1" w:styleId="BodyTextChar">
     <w:name w:val="Body Text Char"/>
     <w:basedOn w:val="DefaultParagraphFont"/>
     <w:link w:val="BodyText"/>
   </w:style>
-  <w:style w:customStyle="1" w:styleId="VerbatimChar" w:type="character">
+  <w:style w:type="character" w:customStyle="1" w:styleId="VerbatimChar">
     <w:name w:val="Verbatim Char"/>
     <w:basedOn w:val="BodyTextChar"/>
     <w:rPr>
@@ -2820,25 +3098,25 @@
       <w:sz w:val="22"/>
     </w:rPr>
   </w:style>
-  <w:style w:customStyle="1" w:styleId="SectionNumber" w:type="character">
+  <w:style w:type="character" w:customStyle="1" w:styleId="SectionNumber">
     <w:name w:val="Section Number"/>
     <w:basedOn w:val="BodyTextChar"/>
   </w:style>
-  <w:style w:styleId="FootnoteReference" w:type="character">
+  <w:style w:type="character" w:styleId="FootnoteReference">
     <w:name w:val="Footnote Reference"/>
     <w:basedOn w:val="BodyTextChar"/>
     <w:rPr>
       <w:vertAlign w:val="superscript"/>
     </w:rPr>
   </w:style>
-  <w:style w:styleId="Hyperlink" w:type="character">
+  <w:style w:type="character" w:styleId="Hyperlink">
     <w:name w:val="Hyperlink"/>
     <w:basedOn w:val="BodyTextChar"/>
     <w:rPr>
-      <w:color w:themeColor="accent1" w:val="4F81BD"/>
-    </w:rPr>
-  </w:style>
-  <w:style w:styleId="TOCHeading" w:type="paragraph">
+      <w:color w:val="4F81BD" w:themeColor="accent1"/>
+    </w:rPr>
+  </w:style>
+  <w:style w:type="paragraph" w:styleId="TOCHeading">
     <w:name w:val="TOC Heading"/>
     <w:basedOn w:val="Heading1"/>
     <w:next w:val="BodyText"/>
@@ -2850,50 +3128,50 @@
       <w:outlineLvl w:val="9"/>
     </w:pPr>
     <w:rPr>
-      <w:rFonts w:asciiTheme="majorHAnsi" w:cstheme="majorBidi" w:eastAsiaTheme="majorEastAsia" w:hAnsiTheme="majorHAnsi"/>
+      <w:rFonts w:asciiTheme="majorHAnsi" w:eastAsiaTheme="majorEastAsia" w:hAnsiTheme="majorHAnsi" w:cstheme="majorBidi"/>
       <w:b w:val="0"/>
       <w:bCs w:val="0"/>
-      <w:color w:themeColor="accent1" w:themeShade="BF" w:val="365F91"/>
-    </w:rPr>
-  </w:style>
-  <w:style w:customStyle="1" w:styleId="Centered" w:type="paragraph">
+      <w:color w:val="365F91" w:themeColor="accent1" w:themeShade="BF"/>
+    </w:rPr>
+  </w:style>
+  <w:style w:type="paragraph" w:customStyle="1" w:styleId="Centered">
     <w:name w:val="Centered"/>
     <w:basedOn w:val="Normal"/>
     <w:qFormat/>
     <w:pPr>
-      <w:spacing w:after="0" w:before="0" w:line="240" w:lineRule="auto"/>
+      <w:spacing w:before="0" w:after="0" w:line="240" w:lineRule="auto"/>
       <w:ind w:firstLine="0"/>
       <w:jc w:val="center"/>
     </w:pPr>
   </w:style>
-  <w:style w:styleId="Footer" w:type="paragraph">
+  <w:style w:type="paragraph" w:styleId="Footer">
     <w:name w:val="footer"/>
     <w:basedOn w:val="Normal"/>
     <w:qFormat/>
     <w:pPr>
       <w:tabs>
-        <w:tab w:pos="4680" w:val="center"/>
+        <w:tab w:val="center" w:pos="4680"/>
       </w:tabs>
-      <w:spacing w:after="0" w:before="0" w:line="240" w:lineRule="auto"/>
+      <w:spacing w:before="0" w:after="0" w:line="240" w:lineRule="auto"/>
       <w:ind w:firstLine="0"/>
       <w:jc w:val="center"/>
     </w:pPr>
   </w:style>
-  <w:style w:styleId="ListLetter" w:type="paragraph">
+  <w:style w:type="paragraph" w:styleId="ListLetter">
     <w:name w:val="List Letter"/>
     <w:basedOn w:val="BodyText"/>
     <w:qFormat/>
     <w:pPr>
-      <w:spacing w:after="0" w:before="0" w:line="540" w:lineRule="exact"/>
-      <w:ind w:hanging="576" w:left="1296"/>
+      <w:spacing w:before="0" w:after="0" w:line="540" w:lineRule="exact"/>
+      <w:ind w:left="1296" w:hanging="576"/>
     </w:pPr>
   </w:style>
-  <w:style w:customStyle="1" w:styleId="Single" w:type="paragraph">
+  <w:style w:type="paragraph" w:customStyle="1" w:styleId="Single">
     <w:name w:val="Single"/>
     <w:basedOn w:val="Normal"/>
     <w:qFormat/>
     <w:pPr>
-      <w:spacing w:after="0" w:before="0" w:line="240" w:lineRule="auto"/>
+      <w:spacing w:before="0" w:after="0" w:line="240" w:lineRule="auto"/>
       <w:ind w:firstLine="0"/>
     </w:pPr>
   </w:style>

</xml_diff>